<commit_message>
Update CV and portfolio with recent AI engineering work
Experience (Maknadata) — add three bullets and reorder so the strongest
LLM work reads first:
- LLM tool calling with Qdrant vector retrieval (Vertex AI embeddings)
- Multimodal LLM-as-judge evaluation pipeline
- Layered DDD services with Cloud Tasks workers on Cloud Run

Projects:
- Add LinkNet Vision QC (POC) card with VisionQC.png artwork
- Extend AI Voice Agent tech stack with Vertex AI and Qdrant
- Fix a pre-existing unclosed <h4> in the Movie Recommendation card

Housekeeping:
- Drop the redundant Resume_before.docx backup (history keeps it)
- Ignore Word lock files (~$*)
- Refresh resume docx and pdf
</commit_message>
<xml_diff>
--- a/downloads/Michael Geraldin Wijaya Resume.docx
+++ b/downloads/Michael Geraldin Wijaya Resume.docx
@@ -567,6 +567,7 @@
           <w:szCs w:val="22"/>
         </w:rPr>
       </w:pPr>
+      <w:proofErr w:type="spellStart"/>
       <w:r>
         <w:rPr>
           <w:rFonts w:ascii="Arial" w:hAnsi="Arial" w:cs="Arial"/>
@@ -577,6 +578,7 @@
         </w:rPr>
         <w:t>Maknadata</w:t>
       </w:r>
+      <w:proofErr w:type="spellEnd"/>
       <w:r>
         <w:rPr>
           <w:rFonts w:ascii="Arial" w:hAnsi="Arial" w:cs="Arial"/>
@@ -651,39 +653,25 @@
           <w:color w:val="0D0D0D" w:themeColor="text1" w:themeTint="F2"/>
           <w:sz w:val="20"/>
         </w:rPr>
-        <w:t>Researching and benchmarking proprietary and open-source speech/language</w:t>
-      </w:r>
-      <w:r>
-        <w:rPr>
-          <w:rFonts w:ascii="Arial" w:eastAsia="Times New Roman" w:hAnsi="Arial" w:cs="Arial"/>
-          <w:color w:val="0D0D0D" w:themeColor="text1" w:themeTint="F2"/>
-          <w:sz w:val="20"/>
-        </w:rPr>
-        <w:t xml:space="preserve"> </w:t>
-      </w:r>
-      <w:r>
-        <w:rPr>
-          <w:rFonts w:ascii="Arial" w:eastAsia="Times New Roman" w:hAnsi="Arial" w:cs="Arial"/>
-          <w:color w:val="0D0D0D" w:themeColor="text1" w:themeTint="F2"/>
-          <w:sz w:val="20"/>
-        </w:rPr>
-        <w:t>models to evaluate cost-efficiency and self-hosting feasibility, reducing</w:t>
-      </w:r>
-      <w:r>
-        <w:rPr>
-          <w:rFonts w:ascii="Arial" w:eastAsia="Times New Roman" w:hAnsi="Arial" w:cs="Arial"/>
-          <w:color w:val="0D0D0D" w:themeColor="text1" w:themeTint="F2"/>
-          <w:sz w:val="20"/>
-        </w:rPr>
-        <w:t xml:space="preserve"> </w:t>
-      </w:r>
-      <w:r>
-        <w:rPr>
-          <w:rFonts w:ascii="Arial" w:eastAsia="Times New Roman" w:hAnsi="Arial" w:cs="Arial"/>
-          <w:color w:val="0D0D0D" w:themeColor="text1" w:themeTint="F2"/>
-          <w:sz w:val="20"/>
-        </w:rPr>
-        <w:t>dependency on third-party APIs.</w:t>
+        <w:t xml:space="preserve">Implemented LLM tool calling to control each conversation turn, grounding responses in scenario facts through </w:t>
+      </w:r>
+      <w:proofErr w:type="spellStart"/>
+      <w:r>
+        <w:rPr>
+          <w:rFonts w:ascii="Arial" w:eastAsia="Times New Roman" w:hAnsi="Arial" w:cs="Arial"/>
+          <w:color w:val="0D0D0D" w:themeColor="text1" w:themeTint="F2"/>
+          <w:sz w:val="20"/>
+        </w:rPr>
+        <w:t>Qdrant</w:t>
+      </w:r>
+      <w:proofErr w:type="spellEnd"/>
+      <w:r>
+        <w:rPr>
+          <w:rFonts w:ascii="Arial" w:eastAsia="Times New Roman" w:hAnsi="Arial" w:cs="Arial"/>
+          <w:color w:val="0D0D0D" w:themeColor="text1" w:themeTint="F2"/>
+          <w:sz w:val="20"/>
+        </w:rPr>
+        <w:t xml:space="preserve"> vector retrieval (Vertex AI embeddings).</w:t>
       </w:r>
     </w:p>
     <w:p>
@@ -708,23 +696,7 @@
           <w:color w:val="0D0D0D" w:themeColor="text1" w:themeTint="F2"/>
           <w:sz w:val="20"/>
         </w:rPr>
-        <w:t>Implemented logging and monitoring (observability) for a compliance audit</w:t>
-      </w:r>
-      <w:r>
-        <w:rPr>
-          <w:rFonts w:ascii="Arial" w:eastAsia="Times New Roman" w:hAnsi="Arial" w:cs="Arial"/>
-          <w:color w:val="0D0D0D" w:themeColor="text1" w:themeTint="F2"/>
-          <w:sz w:val="20"/>
-        </w:rPr>
-        <w:t xml:space="preserve"> </w:t>
-      </w:r>
-      <w:r>
-        <w:rPr>
-          <w:rFonts w:ascii="Arial" w:eastAsia="Times New Roman" w:hAnsi="Arial" w:cs="Arial"/>
-          <w:color w:val="0D0D0D" w:themeColor="text1" w:themeTint="F2"/>
-          <w:sz w:val="20"/>
-        </w:rPr>
-        <w:t>backend service.</w:t>
+        <w:t>Built a multimodal LLM-as-judge pipeline scoring recorded sales conversations against a versioned rubric.</w:t>
       </w:r>
     </w:p>
     <w:p>
@@ -749,6 +721,129 @@
           <w:color w:val="0D0D0D" w:themeColor="text1" w:themeTint="F2"/>
           <w:sz w:val="20"/>
         </w:rPr>
+        <w:t>Researching and benchmarking proprietary and open-source speech/language</w:t>
+      </w:r>
+      <w:r>
+        <w:rPr>
+          <w:rFonts w:ascii="Arial" w:eastAsia="Times New Roman" w:hAnsi="Arial" w:cs="Arial"/>
+          <w:color w:val="0D0D0D" w:themeColor="text1" w:themeTint="F2"/>
+          <w:sz w:val="20"/>
+        </w:rPr>
+        <w:t xml:space="preserve"> </w:t>
+      </w:r>
+      <w:r>
+        <w:rPr>
+          <w:rFonts w:ascii="Arial" w:eastAsia="Times New Roman" w:hAnsi="Arial" w:cs="Arial"/>
+          <w:color w:val="0D0D0D" w:themeColor="text1" w:themeTint="F2"/>
+          <w:sz w:val="20"/>
+        </w:rPr>
+        <w:t>models to evaluate cost-efficiency and self-hosting feasibility, reducing</w:t>
+      </w:r>
+      <w:r>
+        <w:rPr>
+          <w:rFonts w:ascii="Arial" w:eastAsia="Times New Roman" w:hAnsi="Arial" w:cs="Arial"/>
+          <w:color w:val="0D0D0D" w:themeColor="text1" w:themeTint="F2"/>
+          <w:sz w:val="20"/>
+        </w:rPr>
+        <w:t xml:space="preserve"> </w:t>
+      </w:r>
+      <w:r>
+        <w:rPr>
+          <w:rFonts w:ascii="Arial" w:eastAsia="Times New Roman" w:hAnsi="Arial" w:cs="Arial"/>
+          <w:color w:val="0D0D0D" w:themeColor="text1" w:themeTint="F2"/>
+          <w:sz w:val="20"/>
+        </w:rPr>
+        <w:t>dependency on third-party APIs.</w:t>
+      </w:r>
+    </w:p>
+    <w:p>
+      <w:pPr>
+        <w:pStyle w:val="ListParagraph"/>
+        <w:numPr>
+          <w:ilvl w:val="0"/>
+          <w:numId w:val="8"/>
+        </w:numPr>
+        <w:spacing w:after="30" w:line="276" w:lineRule="auto"/>
+        <w:ind w:left="284" w:right="26" w:hanging="284"/>
+        <w:jc w:val="both"/>
+        <w:rPr>
+          <w:rFonts w:ascii="Arial" w:eastAsia="Times New Roman" w:hAnsi="Arial" w:cs="Arial"/>
+          <w:color w:val="0D0D0D" w:themeColor="text1" w:themeTint="F2"/>
+          <w:sz w:val="20"/>
+        </w:rPr>
+      </w:pPr>
+      <w:r>
+        <w:rPr>
+          <w:rFonts w:ascii="Arial" w:eastAsia="Times New Roman" w:hAnsi="Arial" w:cs="Arial"/>
+          <w:color w:val="0D0D0D" w:themeColor="text1" w:themeTint="F2"/>
+          <w:sz w:val="20"/>
+        </w:rPr>
+        <w:t>Architected backends as layered DDD services with enforced module boundaries, and dispatched long-running evaluation jobs to Cloud Tasks workers on Cloud Run.</w:t>
+      </w:r>
+    </w:p>
+    <w:p>
+      <w:pPr>
+        <w:pStyle w:val="ListParagraph"/>
+        <w:numPr>
+          <w:ilvl w:val="0"/>
+          <w:numId w:val="8"/>
+        </w:numPr>
+        <w:spacing w:after="30" w:line="276" w:lineRule="auto"/>
+        <w:ind w:left="284" w:right="26" w:hanging="284"/>
+        <w:jc w:val="both"/>
+        <w:rPr>
+          <w:rFonts w:ascii="Arial" w:eastAsia="Times New Roman" w:hAnsi="Arial" w:cs="Arial"/>
+          <w:color w:val="0D0D0D" w:themeColor="text1" w:themeTint="F2"/>
+          <w:sz w:val="20"/>
+        </w:rPr>
+      </w:pPr>
+      <w:r>
+        <w:rPr>
+          <w:rFonts w:ascii="Arial" w:eastAsia="Times New Roman" w:hAnsi="Arial" w:cs="Arial"/>
+          <w:color w:val="0D0D0D" w:themeColor="text1" w:themeTint="F2"/>
+          <w:sz w:val="20"/>
+        </w:rPr>
+        <w:t>Implemented logging and monitoring (observability) for a compliance audit</w:t>
+      </w:r>
+      <w:r>
+        <w:rPr>
+          <w:rFonts w:ascii="Arial" w:eastAsia="Times New Roman" w:hAnsi="Arial" w:cs="Arial"/>
+          <w:color w:val="0D0D0D" w:themeColor="text1" w:themeTint="F2"/>
+          <w:sz w:val="20"/>
+        </w:rPr>
+        <w:t xml:space="preserve"> </w:t>
+      </w:r>
+      <w:r>
+        <w:rPr>
+          <w:rFonts w:ascii="Arial" w:eastAsia="Times New Roman" w:hAnsi="Arial" w:cs="Arial"/>
+          <w:color w:val="0D0D0D" w:themeColor="text1" w:themeTint="F2"/>
+          <w:sz w:val="20"/>
+        </w:rPr>
+        <w:t>backend service.</w:t>
+      </w:r>
+    </w:p>
+    <w:p>
+      <w:pPr>
+        <w:pStyle w:val="ListParagraph"/>
+        <w:numPr>
+          <w:ilvl w:val="0"/>
+          <w:numId w:val="8"/>
+        </w:numPr>
+        <w:spacing w:after="30" w:line="276" w:lineRule="auto"/>
+        <w:ind w:left="284" w:right="26" w:hanging="284"/>
+        <w:jc w:val="both"/>
+        <w:rPr>
+          <w:rFonts w:ascii="Arial" w:eastAsia="Times New Roman" w:hAnsi="Arial" w:cs="Arial"/>
+          <w:color w:val="0D0D0D" w:themeColor="text1" w:themeTint="F2"/>
+          <w:sz w:val="20"/>
+        </w:rPr>
+      </w:pPr>
+      <w:r>
+        <w:rPr>
+          <w:rFonts w:ascii="Arial" w:eastAsia="Times New Roman" w:hAnsi="Arial" w:cs="Arial"/>
+          <w:color w:val="0D0D0D" w:themeColor="text1" w:themeTint="F2"/>
+          <w:sz w:val="20"/>
+        </w:rPr>
         <w:t xml:space="preserve">Developed an automated system that merges draft reports and interview transcripts using LLMs, streamlining document </w:t>
       </w:r>
       <w:r>
@@ -810,7 +905,27 @@
           <w:sz w:val="20"/>
           <w:szCs w:val="20"/>
         </w:rPr>
-        <w:t xml:space="preserve">with FastAPI and PostgreSQL </w:t>
+        <w:t xml:space="preserve">with </w:t>
+      </w:r>
+      <w:proofErr w:type="spellStart"/>
+      <w:r>
+        <w:rPr>
+          <w:rFonts w:ascii="Arial" w:hAnsi="Arial" w:cs="Arial"/>
+          <w:color w:val="0D0D0D" w:themeColor="text1" w:themeTint="F2"/>
+          <w:sz w:val="20"/>
+          <w:szCs w:val="20"/>
+        </w:rPr>
+        <w:t>FastAPI</w:t>
+      </w:r>
+      <w:proofErr w:type="spellEnd"/>
+      <w:r>
+        <w:rPr>
+          <w:rFonts w:ascii="Arial" w:hAnsi="Arial" w:cs="Arial"/>
+          <w:color w:val="0D0D0D" w:themeColor="text1" w:themeTint="F2"/>
+          <w:sz w:val="20"/>
+          <w:szCs w:val="20"/>
+        </w:rPr>
+        <w:t xml:space="preserve"> and PostgreSQL </w:t>
       </w:r>
       <w:r>
         <w:rPr>
@@ -838,13 +953,23 @@
           <w:sz w:val="20"/>
         </w:rPr>
       </w:pPr>
-      <w:r>
-        <w:rPr>
-          <w:rFonts w:ascii="Arial" w:eastAsia="Times New Roman" w:hAnsi="Arial" w:cs="Arial"/>
-          <w:color w:val="0D0D0D" w:themeColor="text1" w:themeTint="F2"/>
-          <w:sz w:val="20"/>
-        </w:rPr>
-        <w:t>Analyzed business use cases to identify opportunities for AI-driven solutions.</w:t>
+      <w:proofErr w:type="spellStart"/>
+      <w:r>
+        <w:rPr>
+          <w:rFonts w:ascii="Arial" w:eastAsia="Times New Roman" w:hAnsi="Arial" w:cs="Arial"/>
+          <w:color w:val="0D0D0D" w:themeColor="text1" w:themeTint="F2"/>
+          <w:sz w:val="20"/>
+        </w:rPr>
+        <w:t>Analyzed</w:t>
+      </w:r>
+      <w:proofErr w:type="spellEnd"/>
+      <w:r>
+        <w:rPr>
+          <w:rFonts w:ascii="Arial" w:eastAsia="Times New Roman" w:hAnsi="Arial" w:cs="Arial"/>
+          <w:color w:val="0D0D0D" w:themeColor="text1" w:themeTint="F2"/>
+          <w:sz w:val="20"/>
+        </w:rPr>
+        <w:t xml:space="preserve"> business use cases to identify opportunities for AI-driven solutions.</w:t>
       </w:r>
     </w:p>
     <w:p>
@@ -1035,7 +1160,25 @@
           <w:color w:val="0D0D0D" w:themeColor="text1" w:themeTint="F2"/>
           <w:szCs w:val="22"/>
         </w:rPr>
-        <w:t>Project-Based Virtual Intern: Data Scientist – ID/X Partners x Rakamin Academy</w:t>
+        <w:t xml:space="preserve">Project-Based Virtual Intern: Data Scientist – ID/X Partners x </w:t>
+      </w:r>
+      <w:proofErr w:type="spellStart"/>
+      <w:r>
+        <w:rPr>
+          <w:rFonts w:ascii="Arial" w:hAnsi="Arial" w:cs="Arial"/>
+          <w:color w:val="0D0D0D" w:themeColor="text1" w:themeTint="F2"/>
+          <w:szCs w:val="22"/>
+        </w:rPr>
+        <w:t>Rakamin</w:t>
+      </w:r>
+      <w:proofErr w:type="spellEnd"/>
+      <w:r>
+        <w:rPr>
+          <w:rFonts w:ascii="Arial" w:hAnsi="Arial" w:cs="Arial"/>
+          <w:color w:val="0D0D0D" w:themeColor="text1" w:themeTint="F2"/>
+          <w:szCs w:val="22"/>
+        </w:rPr>
+        <w:t xml:space="preserve"> Academy</w:t>
       </w:r>
       <w:r>
         <w:rPr>
@@ -1283,33 +1426,73 @@
     </w:p>
     <w:p>
       <w:pPr>
+        <w:spacing w:after="0" w:line="276" w:lineRule="auto"/>
+        <w:ind w:right="26"/>
+        <w:jc w:val="both"/>
+        <w:rPr>
+          <w:rFonts w:ascii="Arial" w:eastAsia="Times New Roman" w:hAnsi="Arial" w:cs="Arial"/>
+          <w:color w:val="0D0D0D" w:themeColor="text1" w:themeTint="F2"/>
+          <w:sz w:val="20"/>
+          <w:szCs w:val="20"/>
+        </w:rPr>
+      </w:pPr>
+      <w:r>
+        <w:rPr>
+          <w:rFonts w:ascii="Arial" w:eastAsia="Times New Roman" w:hAnsi="Arial" w:cs="Arial"/>
+          <w:color w:val="0D0D0D" w:themeColor="text1" w:themeTint="F2"/>
+          <w:sz w:val="20"/>
+          <w:szCs w:val="20"/>
+        </w:rPr>
+        <w:t xml:space="preserve">Streaming: </w:t>
+      </w:r>
+      <w:r>
+        <w:rPr>
+          <w:rFonts w:ascii="Arial" w:eastAsia="Times New Roman" w:hAnsi="Arial" w:cs="Arial"/>
+          <w:color w:val="0D0D0D" w:themeColor="text1" w:themeTint="F2"/>
+          <w:sz w:val="20"/>
+          <w:szCs w:val="20"/>
+        </w:rPr>
+        <w:t>Data Science</w:t>
+      </w:r>
+    </w:p>
+    <w:p>
+      <w:pPr>
         <w:spacing w:line="276" w:lineRule="auto"/>
         <w:ind w:right="26"/>
         <w:jc w:val="both"/>
         <w:rPr>
-          <w:rFonts w:ascii="Arial" w:eastAsia="Times New Roman" w:hAnsi="Arial" w:cs="Arial"/>
-          <w:color w:val="0D0D0D" w:themeColor="text1" w:themeTint="F2"/>
-          <w:sz w:val="20"/>
-          <w:szCs w:val="20"/>
-        </w:rPr>
-      </w:pPr>
-      <w:r>
-        <w:rPr>
-          <w:rFonts w:ascii="Arial" w:eastAsia="Times New Roman" w:hAnsi="Arial" w:cs="Arial"/>
-          <w:color w:val="0D0D0D" w:themeColor="text1" w:themeTint="F2"/>
-          <w:sz w:val="20"/>
-          <w:szCs w:val="20"/>
-        </w:rPr>
-        <w:t xml:space="preserve">Streaming: </w:t>
-      </w:r>
-      <w:r>
-        <w:rPr>
-          <w:rFonts w:ascii="Arial" w:eastAsia="Times New Roman" w:hAnsi="Arial" w:cs="Arial"/>
-          <w:color w:val="0D0D0D" w:themeColor="text1" w:themeTint="F2"/>
-          <w:sz w:val="20"/>
-          <w:szCs w:val="20"/>
-        </w:rPr>
-        <w:t>Data Science</w:t>
+          <w:rFonts w:ascii="Arial" w:hAnsi="Arial" w:cs="Arial"/>
+          <w:color w:val="0D0D0D" w:themeColor="text1" w:themeTint="F2"/>
+          <w:sz w:val="20"/>
+          <w:szCs w:val="20"/>
+        </w:rPr>
+      </w:pPr>
+      <w:r>
+        <w:rPr>
+          <w:rFonts w:ascii="Arial" w:eastAsia="Times New Roman" w:hAnsi="Arial" w:cs="Arial"/>
+          <w:color w:val="0D0D0D" w:themeColor="text1" w:themeTint="F2"/>
+          <w:sz w:val="20"/>
+          <w:szCs w:val="20"/>
+        </w:rPr>
+        <w:t xml:space="preserve">Latest </w:t>
+      </w:r>
+      <w:r>
+        <w:rPr>
+          <w:rFonts w:ascii="Arial" w:eastAsia="Times New Roman" w:hAnsi="Arial" w:cs="Arial"/>
+          <w:color w:val="0D0D0D" w:themeColor="text1" w:themeTint="F2"/>
+          <w:sz w:val="20"/>
+          <w:szCs w:val="20"/>
+        </w:rPr>
+        <w:t xml:space="preserve">GPA: </w:t>
+      </w:r>
+      <w:r>
+        <w:rPr>
+          <w:rFonts w:ascii="Arial" w:eastAsia="Times New Roman" w:hAnsi="Arial" w:cs="Arial"/>
+          <w:color w:val="0D0D0D" w:themeColor="text1" w:themeTint="F2"/>
+          <w:sz w:val="20"/>
+          <w:szCs w:val="20"/>
+        </w:rPr>
+        <w:t>4.00</w:t>
       </w:r>
     </w:p>
     <w:p>
@@ -1459,7 +1642,7 @@
           <w:sz w:val="20"/>
           <w:szCs w:val="20"/>
         </w:rPr>
-        <w:t>Latest GPA: 3.9</w:t>
+        <w:t>GPA: 3.9</w:t>
       </w:r>
       <w:r>
         <w:rPr>
@@ -1551,16 +1734,67 @@
           <w:sz w:val="20"/>
           <w:szCs w:val="20"/>
         </w:rPr>
-        <w:t>Awardee of Beasiswa</w:t>
-      </w:r>
-      <w:r>
-        <w:rPr>
-          <w:rFonts w:ascii="Arial" w:eastAsia="Times New Roman" w:hAnsi="Arial" w:cs="Arial"/>
-          <w:color w:val="0D0D0D" w:themeColor="text1" w:themeTint="F2"/>
-          <w:sz w:val="20"/>
-          <w:szCs w:val="20"/>
-        </w:rPr>
-        <w:t xml:space="preserve"> Unggulan Kemendikbudristek </w:t>
+        <w:t xml:space="preserve">Awardee of </w:t>
+      </w:r>
+      <w:proofErr w:type="spellStart"/>
+      <w:r>
+        <w:rPr>
+          <w:rFonts w:ascii="Arial" w:eastAsia="Times New Roman" w:hAnsi="Arial" w:cs="Arial"/>
+          <w:color w:val="0D0D0D" w:themeColor="text1" w:themeTint="F2"/>
+          <w:sz w:val="20"/>
+          <w:szCs w:val="20"/>
+        </w:rPr>
+        <w:t>Beasiswa</w:t>
+      </w:r>
+      <w:proofErr w:type="spellEnd"/>
+      <w:r>
+        <w:rPr>
+          <w:rFonts w:ascii="Arial" w:eastAsia="Times New Roman" w:hAnsi="Arial" w:cs="Arial"/>
+          <w:color w:val="0D0D0D" w:themeColor="text1" w:themeTint="F2"/>
+          <w:sz w:val="20"/>
+          <w:szCs w:val="20"/>
+        </w:rPr>
+        <w:t xml:space="preserve"> </w:t>
+      </w:r>
+      <w:proofErr w:type="spellStart"/>
+      <w:r>
+        <w:rPr>
+          <w:rFonts w:ascii="Arial" w:eastAsia="Times New Roman" w:hAnsi="Arial" w:cs="Arial"/>
+          <w:color w:val="0D0D0D" w:themeColor="text1" w:themeTint="F2"/>
+          <w:sz w:val="20"/>
+          <w:szCs w:val="20"/>
+        </w:rPr>
+        <w:t>Unggulan</w:t>
+      </w:r>
+      <w:proofErr w:type="spellEnd"/>
+      <w:r>
+        <w:rPr>
+          <w:rFonts w:ascii="Arial" w:eastAsia="Times New Roman" w:hAnsi="Arial" w:cs="Arial"/>
+          <w:color w:val="0D0D0D" w:themeColor="text1" w:themeTint="F2"/>
+          <w:sz w:val="20"/>
+          <w:szCs w:val="20"/>
+        </w:rPr>
+        <w:t xml:space="preserve"> </w:t>
+      </w:r>
+      <w:proofErr w:type="spellStart"/>
+      <w:r>
+        <w:rPr>
+          <w:rFonts w:ascii="Arial" w:eastAsia="Times New Roman" w:hAnsi="Arial" w:cs="Arial"/>
+          <w:color w:val="0D0D0D" w:themeColor="text1" w:themeTint="F2"/>
+          <w:sz w:val="20"/>
+          <w:szCs w:val="20"/>
+        </w:rPr>
+        <w:t>Kemendikbudristek</w:t>
+      </w:r>
+      <w:proofErr w:type="spellEnd"/>
+      <w:r>
+        <w:rPr>
+          <w:rFonts w:ascii="Arial" w:eastAsia="Times New Roman" w:hAnsi="Arial" w:cs="Arial"/>
+          <w:color w:val="0D0D0D" w:themeColor="text1" w:themeTint="F2"/>
+          <w:sz w:val="20"/>
+          <w:szCs w:val="20"/>
+        </w:rPr>
+        <w:t xml:space="preserve"> </w:t>
       </w:r>
       <w:r>
         <w:rPr>
@@ -1687,7 +1921,27 @@
           <w:sz w:val="20"/>
           <w:szCs w:val="20"/>
         </w:rPr>
-        <w:t>Top 20 Finalist School of Computer Science Hackaton 2024 BINUS x Microsoft (AI4A)</w:t>
+        <w:t xml:space="preserve">Top 20 Finalist School of Computer Science </w:t>
+      </w:r>
+      <w:proofErr w:type="spellStart"/>
+      <w:r>
+        <w:rPr>
+          <w:rFonts w:ascii="Arial" w:eastAsia="Times New Roman" w:hAnsi="Arial" w:cs="Arial"/>
+          <w:color w:val="0D0D0D" w:themeColor="text1" w:themeTint="F2"/>
+          <w:sz w:val="20"/>
+          <w:szCs w:val="20"/>
+        </w:rPr>
+        <w:t>Hackaton</w:t>
+      </w:r>
+      <w:proofErr w:type="spellEnd"/>
+      <w:r>
+        <w:rPr>
+          <w:rFonts w:ascii="Arial" w:eastAsia="Times New Roman" w:hAnsi="Arial" w:cs="Arial"/>
+          <w:color w:val="0D0D0D" w:themeColor="text1" w:themeTint="F2"/>
+          <w:sz w:val="20"/>
+          <w:szCs w:val="20"/>
+        </w:rPr>
+        <w:t xml:space="preserve"> 2024 BINUS x Microsoft (AI4A)</w:t>
       </w:r>
     </w:p>
     <w:p>
@@ -1884,7 +2138,17 @@
           <w:sz w:val="20"/>
           <w:szCs w:val="20"/>
         </w:rPr>
-        <w:t>A+ (Gold Medal</w:t>
+        <w:t xml:space="preserve">A+ (Gold </w:t>
+      </w:r>
+      <w:proofErr w:type="spellStart"/>
+      <w:r>
+        <w:rPr>
+          <w:rFonts w:ascii="Arial" w:eastAsia="Times New Roman" w:hAnsi="Arial" w:cs="Arial"/>
+          <w:color w:val="0D0D0D" w:themeColor="text1" w:themeTint="F2"/>
+          <w:sz w:val="20"/>
+          <w:szCs w:val="20"/>
+        </w:rPr>
+        <w:t>Medal</w:t>
       </w:r>
       <w:r>
         <w:rPr>
@@ -1895,6 +2159,7 @@
         </w:rPr>
         <w:t>ist</w:t>
       </w:r>
+      <w:proofErr w:type="spellEnd"/>
       <w:r>
         <w:rPr>
           <w:rFonts w:ascii="Arial" w:eastAsia="Times New Roman" w:hAnsi="Arial" w:cs="Arial"/>
@@ -1946,7 +2211,17 @@
           <w:sz w:val="20"/>
           <w:szCs w:val="20"/>
         </w:rPr>
-        <w:t>A+ (Gold Medal</w:t>
+        <w:t xml:space="preserve">A+ (Gold </w:t>
+      </w:r>
+      <w:proofErr w:type="spellStart"/>
+      <w:r>
+        <w:rPr>
+          <w:rFonts w:ascii="Arial" w:eastAsia="Times New Roman" w:hAnsi="Arial" w:cs="Arial"/>
+          <w:color w:val="0D0D0D" w:themeColor="text1" w:themeTint="F2"/>
+          <w:sz w:val="20"/>
+          <w:szCs w:val="20"/>
+        </w:rPr>
+        <w:t>Medal</w:t>
       </w:r>
       <w:r>
         <w:rPr>
@@ -1957,6 +2232,7 @@
         </w:rPr>
         <w:t>ist</w:t>
       </w:r>
+      <w:proofErr w:type="spellEnd"/>
       <w:r>
         <w:rPr>
           <w:rFonts w:ascii="Arial" w:eastAsia="Times New Roman" w:hAnsi="Arial" w:cs="Arial"/>
@@ -2008,7 +2284,27 @@
           <w:sz w:val="20"/>
           <w:szCs w:val="20"/>
         </w:rPr>
-        <w:t xml:space="preserve">Gold Medalist </w:t>
+        <w:t xml:space="preserve">Gold </w:t>
+      </w:r>
+      <w:proofErr w:type="spellStart"/>
+      <w:r>
+        <w:rPr>
+          <w:rFonts w:ascii="Arial" w:eastAsia="Times New Roman" w:hAnsi="Arial" w:cs="Arial"/>
+          <w:color w:val="0D0D0D" w:themeColor="text1" w:themeTint="F2"/>
+          <w:sz w:val="20"/>
+          <w:szCs w:val="20"/>
+        </w:rPr>
+        <w:t>Medalist</w:t>
+      </w:r>
+      <w:proofErr w:type="spellEnd"/>
+      <w:r>
+        <w:rPr>
+          <w:rFonts w:ascii="Arial" w:eastAsia="Times New Roman" w:hAnsi="Arial" w:cs="Arial"/>
+          <w:color w:val="0D0D0D" w:themeColor="text1" w:themeTint="F2"/>
+          <w:sz w:val="20"/>
+          <w:szCs w:val="20"/>
+        </w:rPr>
+        <w:t xml:space="preserve"> </w:t>
       </w:r>
       <w:r>
         <w:rPr>
@@ -2067,7 +2363,27 @@
           <w:sz w:val="20"/>
           <w:szCs w:val="20"/>
         </w:rPr>
-        <w:t>Gold Medalist in the National Student Science Competition - Mathematics</w:t>
+        <w:t xml:space="preserve">Gold </w:t>
+      </w:r>
+      <w:proofErr w:type="spellStart"/>
+      <w:r>
+        <w:rPr>
+          <w:rFonts w:ascii="Arial" w:eastAsia="Times New Roman" w:hAnsi="Arial" w:cs="Arial"/>
+          <w:color w:val="0D0D0D" w:themeColor="text1" w:themeTint="F2"/>
+          <w:sz w:val="20"/>
+          <w:szCs w:val="20"/>
+        </w:rPr>
+        <w:t>Medalist</w:t>
+      </w:r>
+      <w:proofErr w:type="spellEnd"/>
+      <w:r>
+        <w:rPr>
+          <w:rFonts w:ascii="Arial" w:eastAsia="Times New Roman" w:hAnsi="Arial" w:cs="Arial"/>
+          <w:color w:val="0D0D0D" w:themeColor="text1" w:themeTint="F2"/>
+          <w:sz w:val="20"/>
+          <w:szCs w:val="20"/>
+        </w:rPr>
+        <w:t xml:space="preserve"> in the National Student Science Competition - Mathematics</w:t>
       </w:r>
     </w:p>
     <w:p>
@@ -2093,6 +2409,7 @@
           <w:sz w:val="22"/>
           <w:szCs w:val="22"/>
         </w:rPr>
+        <w:lastRenderedPageBreak/>
         <w:t>PROJECTS</w:t>
       </w:r>
       <w:r>
@@ -2128,7 +2445,23 @@
           <w:bCs/>
           <w:color w:val="auto"/>
         </w:rPr>
-        <w:t>AI Voice Agent – Sales Roleplay</w:t>
+        <w:t xml:space="preserve">AI Voice Agent </w:t>
+      </w:r>
+      <w:r>
+        <w:rPr>
+          <w:rFonts w:ascii="Arial" w:hAnsi="Arial" w:cs="Arial"/>
+          <w:bCs/>
+          <w:color w:val="auto"/>
+        </w:rPr>
+        <w:t>-</w:t>
+      </w:r>
+      <w:r>
+        <w:rPr>
+          <w:rFonts w:ascii="Arial" w:hAnsi="Arial" w:cs="Arial"/>
+          <w:bCs/>
+          <w:color w:val="auto"/>
+        </w:rPr>
+        <w:t xml:space="preserve"> Sales Roleplay</w:t>
       </w:r>
       <w:r>
         <w:rPr>
@@ -2188,58 +2521,32 @@
     </w:p>
     <w:p>
       <w:pPr>
-        <w:pStyle w:val="Heading1"/>
-        <w:tabs>
-          <w:tab w:val="right" w:pos="10695"/>
-        </w:tabs>
-        <w:spacing w:line="276" w:lineRule="auto"/>
-        <w:ind w:left="0" w:right="26" w:firstLine="0"/>
-        <w:rPr>
-          <w:rFonts w:ascii="Arial" w:hAnsi="Arial" w:cs="Arial"/>
-          <w:b w:val="0"/>
+        <w:spacing w:after="30" w:line="276" w:lineRule="auto"/>
+        <w:ind w:right="26"/>
+        <w:jc w:val="both"/>
+        <w:rPr>
+          <w:rFonts w:ascii="Arial" w:hAnsi="Arial" w:cs="Arial"/>
+          <w:b/>
           <w:bCs/>
-          <w:color w:val="auto"/>
-          <w:sz w:val="20"/>
-        </w:rPr>
-      </w:pPr>
-      <w:r>
-        <w:rPr>
-          <w:rFonts w:ascii="Arial" w:hAnsi="Arial" w:cs="Arial"/>
+        </w:rPr>
+      </w:pPr>
+      <w:proofErr w:type="spellStart"/>
+      <w:r>
+        <w:rPr>
+          <w:rFonts w:ascii="Arial" w:hAnsi="Arial" w:cs="Arial"/>
+          <w:b/>
           <w:bCs/>
-          <w:color w:val="auto"/>
-        </w:rPr>
-        <w:t xml:space="preserve">Report and Interview Integration </w:t>
-      </w:r>
-      <w:r>
-        <w:rPr>
-          <w:rFonts w:ascii="Arial" w:hAnsi="Arial" w:cs="Arial"/>
+        </w:rPr>
+        <w:t>LinkNet</w:t>
+      </w:r>
+      <w:proofErr w:type="spellEnd"/>
+      <w:r>
+        <w:rPr>
+          <w:rFonts w:ascii="Arial" w:hAnsi="Arial" w:cs="Arial"/>
+          <w:b/>
           <w:bCs/>
-          <w:color w:val="auto"/>
-        </w:rPr>
-        <w:t>–</w:t>
-      </w:r>
-      <w:r>
-        <w:rPr>
-          <w:rFonts w:ascii="Arial" w:hAnsi="Arial" w:cs="Arial"/>
-          <w:bCs/>
-          <w:color w:val="auto"/>
-        </w:rPr>
-        <w:t xml:space="preserve"> Automated</w:t>
-      </w:r>
-      <w:r>
-        <w:rPr>
-          <w:rFonts w:ascii="Arial" w:hAnsi="Arial" w:cs="Arial"/>
-          <w:bCs/>
-          <w:color w:val="auto"/>
-        </w:rPr>
-        <w:t xml:space="preserve"> System</w:t>
-      </w:r>
-      <w:r>
-        <w:rPr>
-          <w:rFonts w:ascii="Arial" w:hAnsi="Arial" w:cs="Arial"/>
-          <w:color w:val="auto"/>
-        </w:rPr>
-        <w:tab/>
+        </w:rPr>
+        <w:t xml:space="preserve"> Vision QC POC</w:t>
       </w:r>
     </w:p>
     <w:p>
@@ -2253,42 +2560,28 @@
         <w:ind w:left="284" w:right="26" w:hanging="284"/>
         <w:jc w:val="both"/>
         <w:rPr>
-          <w:rFonts w:ascii="Arial" w:eastAsia="Times New Roman" w:hAnsi="Arial" w:cs="Arial"/>
-          <w:color w:val="auto"/>
-          <w:sz w:val="20"/>
-        </w:rPr>
-      </w:pPr>
-      <w:r>
-        <w:rPr>
-          <w:rFonts w:ascii="Arial" w:eastAsia="Times New Roman" w:hAnsi="Arial" w:cs="Arial"/>
-          <w:color w:val="auto"/>
-          <w:sz w:val="20"/>
-        </w:rPr>
-        <w:t>A</w:t>
-      </w:r>
-      <w:r>
-        <w:rPr>
-          <w:rFonts w:ascii="Arial" w:eastAsia="Times New Roman" w:hAnsi="Arial" w:cs="Arial"/>
-          <w:color w:val="auto"/>
-          <w:sz w:val="20"/>
-        </w:rPr>
-        <w:t xml:space="preserve">utomated system that merges draft reports and interview transcripts using LLMs, streamlining document </w:t>
-      </w:r>
-      <w:r>
-        <w:rPr>
-          <w:rFonts w:ascii="Arial" w:eastAsia="Times New Roman" w:hAnsi="Arial" w:cs="Arial"/>
-          <w:color w:val="auto"/>
-          <w:sz w:val="20"/>
-        </w:rPr>
-        <w:t>integration</w:t>
-      </w:r>
-      <w:r>
-        <w:rPr>
-          <w:rFonts w:ascii="Arial" w:eastAsia="Times New Roman" w:hAnsi="Arial" w:cs="Arial"/>
-          <w:color w:val="auto"/>
-          <w:sz w:val="20"/>
-        </w:rPr>
-        <w:t xml:space="preserve"> and enhancing workflow efficiency.</w:t>
+          <w:rFonts w:ascii="Arial" w:hAnsi="Arial" w:cs="Arial"/>
+        </w:rPr>
+      </w:pPr>
+      <w:r>
+        <w:rPr>
+          <w:rFonts w:ascii="Arial" w:hAnsi="Arial" w:cs="Arial"/>
+        </w:rPr>
+        <w:t xml:space="preserve">Vision LLM system auditing FTTH field installation photos against audit category standards for an Indonesian ISP. Achieved 83.6% overall accuracy and 85.5% defect recall on a benchmark of 286 photos. Benchmarked open and closed VLMs behind a modular provider layer (Qwen3-VL on self-hosted </w:t>
+      </w:r>
+      <w:proofErr w:type="spellStart"/>
+      <w:r>
+        <w:rPr>
+          <w:rFonts w:ascii="Arial" w:hAnsi="Arial" w:cs="Arial"/>
+        </w:rPr>
+        <w:t>vLLM</w:t>
+      </w:r>
+      <w:proofErr w:type="spellEnd"/>
+      <w:r>
+        <w:rPr>
+          <w:rFonts w:ascii="Arial" w:hAnsi="Arial" w:cs="Arial"/>
+        </w:rPr>
+        <w:t>, Claude/Kimi K2.5/Nova via AWS Bedrock, Gemini via Vertex AI) and selected self-hosted Qwen3-VL-32B to meet data residency constraints. Added an OpenCV quality gate to filter unusable photos before any LLM call.</w:t>
       </w:r>
     </w:p>
     <w:p>
@@ -2301,42 +2594,50 @@
         <w:ind w:left="0" w:right="26" w:firstLine="0"/>
         <w:rPr>
           <w:rFonts w:ascii="Arial" w:hAnsi="Arial" w:cs="Arial"/>
-          <w:color w:val="auto"/>
-        </w:rPr>
-      </w:pPr>
-      <w:r>
-        <w:rPr>
-          <w:rFonts w:ascii="Arial" w:hAnsi="Arial" w:cs="Arial"/>
-          <w:bCs/>
-          <w:color w:val="auto"/>
-        </w:rPr>
-        <w:lastRenderedPageBreak/>
-        <w:t xml:space="preserve">Alma - </w:t>
-      </w:r>
-      <w:r>
-        <w:rPr>
-          <w:rFonts w:ascii="Arial" w:hAnsi="Arial" w:cs="Arial"/>
-          <w:bCs/>
-          <w:color w:val="auto"/>
-        </w:rPr>
-        <w:t>Agentic Conversational System</w:t>
-      </w:r>
-      <w:r>
-        <w:rPr>
-          <w:rFonts w:ascii="Arial" w:hAnsi="Arial" w:cs="Arial"/>
-          <w:color w:val="auto"/>
-        </w:rPr>
-        <w:tab/>
-      </w:r>
-      <w:r>
-        <w:rPr>
-          <w:rFonts w:ascii="Arial" w:hAnsi="Arial" w:cs="Arial"/>
           <w:b w:val="0"/>
           <w:bCs/>
           <w:color w:val="auto"/>
           <w:sz w:val="20"/>
         </w:rPr>
-        <w:t>12/2024</w:t>
+      </w:pPr>
+      <w:r>
+        <w:rPr>
+          <w:rFonts w:ascii="Arial" w:hAnsi="Arial" w:cs="Arial"/>
+          <w:bCs/>
+          <w:color w:val="auto"/>
+        </w:rPr>
+        <w:t xml:space="preserve">Report and Interview Integration </w:t>
+      </w:r>
+      <w:r>
+        <w:rPr>
+          <w:rFonts w:ascii="Arial" w:hAnsi="Arial" w:cs="Arial"/>
+          <w:bCs/>
+          <w:color w:val="auto"/>
+        </w:rPr>
+        <w:t>–</w:t>
+      </w:r>
+      <w:r>
+        <w:rPr>
+          <w:rFonts w:ascii="Arial" w:hAnsi="Arial" w:cs="Arial"/>
+          <w:bCs/>
+          <w:color w:val="auto"/>
+        </w:rPr>
+        <w:t xml:space="preserve"> Automated</w:t>
+      </w:r>
+      <w:r>
+        <w:rPr>
+          <w:rFonts w:ascii="Arial" w:hAnsi="Arial" w:cs="Arial"/>
+          <w:bCs/>
+          <w:color w:val="auto"/>
+        </w:rPr>
+        <w:t xml:space="preserve"> System</w:t>
+      </w:r>
+      <w:r>
+        <w:rPr>
+          <w:rFonts w:ascii="Arial" w:hAnsi="Arial" w:cs="Arial"/>
+          <w:color w:val="auto"/>
+        </w:rPr>
+        <w:tab/>
       </w:r>
     </w:p>
     <w:p>
@@ -2361,7 +2662,7 @@
           <w:color w:val="auto"/>
           <w:sz w:val="20"/>
         </w:rPr>
-        <w:t>C</w:t>
+        <w:t>A</w:t>
       </w:r>
       <w:r>
         <w:rPr>
@@ -2369,7 +2670,23 @@
           <w:color w:val="auto"/>
           <w:sz w:val="20"/>
         </w:rPr>
-        <w:t>onversational agentic system that enables users to interact with multiple data sources through natural language. The system integrates RAG (Retrieval-Augmented Generation) for document-based queries, text-to-SQL for database operations (e.g., checking product stock), and web search capabilities for real-time information retrieval.</w:t>
+        <w:t xml:space="preserve">utomated system that merges draft reports and interview transcripts using LLMs, streamlining document </w:t>
+      </w:r>
+      <w:r>
+        <w:rPr>
+          <w:rFonts w:ascii="Arial" w:eastAsia="Times New Roman" w:hAnsi="Arial" w:cs="Arial"/>
+          <w:color w:val="auto"/>
+          <w:sz w:val="20"/>
+        </w:rPr>
+        <w:t>integration</w:t>
+      </w:r>
+      <w:r>
+        <w:rPr>
+          <w:rFonts w:ascii="Arial" w:eastAsia="Times New Roman" w:hAnsi="Arial" w:cs="Arial"/>
+          <w:color w:val="auto"/>
+          <w:sz w:val="20"/>
+        </w:rPr>
+        <w:t xml:space="preserve"> and enhancing workflow efficiency.</w:t>
       </w:r>
     </w:p>
     <w:p>
@@ -2391,7 +2708,7 @@
           <w:bCs/>
           <w:color w:val="auto"/>
         </w:rPr>
-        <w:t>Research Assistant Bot</w:t>
+        <w:t xml:space="preserve">Alma - </w:t>
       </w:r>
       <w:r>
         <w:rPr>
@@ -2399,7 +2716,7 @@
           <w:bCs/>
           <w:color w:val="auto"/>
         </w:rPr>
-        <w:t>_GenAI_LLM</w:t>
+        <w:t>Agentic Conversational System</w:t>
       </w:r>
       <w:r>
         <w:rPr>
@@ -2441,7 +2758,7 @@
           <w:color w:val="auto"/>
           <w:sz w:val="20"/>
         </w:rPr>
-        <w:t>Research Assistant Bot (RAB) is a user-friendly research tool for retrieving information. Users can input article URLs or upload a PDF file and ask questions related to the content. It is built using Groq, LangChain, FAISS, Llama</w:t>
+        <w:t>C</w:t>
       </w:r>
       <w:r>
         <w:rPr>
@@ -2449,23 +2766,7 @@
           <w:color w:val="auto"/>
           <w:sz w:val="20"/>
         </w:rPr>
-        <w:t xml:space="preserve"> </w:t>
-      </w:r>
-      <w:r>
-        <w:rPr>
-          <w:rFonts w:ascii="Arial" w:eastAsia="Times New Roman" w:hAnsi="Arial" w:cs="Arial"/>
-          <w:color w:val="auto"/>
-          <w:sz w:val="20"/>
-        </w:rPr>
-        <w:t>3, and Streamlit</w:t>
-      </w:r>
-      <w:r>
-        <w:rPr>
-          <w:rFonts w:ascii="Arial" w:eastAsia="Times New Roman" w:hAnsi="Arial" w:cs="Arial"/>
-          <w:color w:val="auto"/>
-          <w:sz w:val="20"/>
-        </w:rPr>
-        <w:t>.</w:t>
+        <w:t>onversational agentic system that enables users to interact with multiple data sources through natural language. The system integrates RAG (Retrieval-Augmented Generation) for document-based queries, text-to-SQL for database operations (e.g., checking product stock), and web search capabilities for real-time information retrieval.</w:t>
       </w:r>
     </w:p>
     <w:p>
@@ -2478,21 +2779,39 @@
         <w:ind w:left="0" w:right="26" w:firstLine="0"/>
         <w:rPr>
           <w:rFonts w:ascii="Arial" w:hAnsi="Arial" w:cs="Arial"/>
-          <w:color w:val="0D0D0D" w:themeColor="text1" w:themeTint="F2"/>
+          <w:color w:val="auto"/>
         </w:rPr>
       </w:pPr>
       <w:r>
         <w:rPr>
           <w:rFonts w:ascii="Arial" w:hAnsi="Arial" w:cs="Arial"/>
           <w:bCs/>
-          <w:color w:val="0D0D0D" w:themeColor="text1" w:themeTint="F2"/>
-        </w:rPr>
-        <w:t>Plant Disease Detection</w:t>
-      </w:r>
-      <w:r>
-        <w:rPr>
-          <w:rFonts w:ascii="Arial" w:hAnsi="Arial" w:cs="Arial"/>
-          <w:color w:val="0D0D0D" w:themeColor="text1" w:themeTint="F2"/>
+          <w:color w:val="auto"/>
+        </w:rPr>
+        <w:t xml:space="preserve">Research Assistant </w:t>
+      </w:r>
+      <w:proofErr w:type="spellStart"/>
+      <w:r>
+        <w:rPr>
+          <w:rFonts w:ascii="Arial" w:hAnsi="Arial" w:cs="Arial"/>
+          <w:bCs/>
+          <w:color w:val="auto"/>
+        </w:rPr>
+        <w:t>Bot</w:t>
+      </w:r>
+      <w:r>
+        <w:rPr>
+          <w:rFonts w:ascii="Arial" w:hAnsi="Arial" w:cs="Arial"/>
+          <w:bCs/>
+          <w:color w:val="auto"/>
+        </w:rPr>
+        <w:t>_GenAI_LLM</w:t>
+      </w:r>
+      <w:proofErr w:type="spellEnd"/>
+      <w:r>
+        <w:rPr>
+          <w:rFonts w:ascii="Arial" w:hAnsi="Arial" w:cs="Arial"/>
+          <w:color w:val="auto"/>
         </w:rPr>
         <w:tab/>
       </w:r>
@@ -2501,46 +2820,7 @@
           <w:rFonts w:ascii="Arial" w:hAnsi="Arial" w:cs="Arial"/>
           <w:b w:val="0"/>
           <w:bCs/>
-          <w:color w:val="0D0D0D" w:themeColor="text1" w:themeTint="F2"/>
-          <w:sz w:val="20"/>
-        </w:rPr>
-        <w:t>10</w:t>
-      </w:r>
-      <w:r>
-        <w:rPr>
-          <w:rFonts w:ascii="Arial" w:hAnsi="Arial" w:cs="Arial"/>
-          <w:b w:val="0"/>
-          <w:bCs/>
-          <w:color w:val="0D0D0D" w:themeColor="text1" w:themeTint="F2"/>
-          <w:sz w:val="20"/>
-        </w:rPr>
-        <w:t>/2024</w:t>
-      </w:r>
-      <w:r>
-        <w:rPr>
-          <w:rFonts w:ascii="Arial" w:hAnsi="Arial" w:cs="Arial"/>
-          <w:b w:val="0"/>
-          <w:bCs/>
-          <w:color w:val="0D0D0D" w:themeColor="text1" w:themeTint="F2"/>
-          <w:sz w:val="20"/>
-        </w:rPr>
-        <w:t xml:space="preserve"> </w:t>
-      </w:r>
-      <w:r>
-        <w:rPr>
-          <w:rFonts w:ascii="Arial" w:hAnsi="Arial" w:cs="Arial"/>
-          <w:bCs/>
-          <w:color w:val="0D0D0D" w:themeColor="text1" w:themeTint="F2"/>
-          <w:sz w:val="20"/>
-        </w:rPr>
-        <w:t xml:space="preserve">– </w:t>
-      </w:r>
-      <w:r>
-        <w:rPr>
-          <w:rFonts w:ascii="Arial" w:hAnsi="Arial" w:cs="Arial"/>
-          <w:b w:val="0"/>
-          <w:bCs/>
-          <w:color w:val="0D0D0D" w:themeColor="text1" w:themeTint="F2"/>
+          <w:color w:val="auto"/>
           <w:sz w:val="20"/>
         </w:rPr>
         <w:t>12/2024</w:t>
@@ -2558,22 +2838,58 @@
         <w:jc w:val="both"/>
         <w:rPr>
           <w:rFonts w:ascii="Arial" w:eastAsia="Times New Roman" w:hAnsi="Arial" w:cs="Arial"/>
-          <w:color w:val="0D0D0D" w:themeColor="text1" w:themeTint="F2"/>
-          <w:sz w:val="20"/>
-        </w:rPr>
-      </w:pPr>
-      <w:r>
-        <w:rPr>
-          <w:rFonts w:ascii="Arial" w:eastAsia="Times New Roman" w:hAnsi="Arial" w:cs="Arial"/>
-          <w:color w:val="0D0D0D" w:themeColor="text1" w:themeTint="F2"/>
-          <w:sz w:val="20"/>
-        </w:rPr>
-        <w:t>This plant disease detection system utilizes traditional ML methods like SVM and Random Forest with feature extraction techniques (Hu Moments, Haralick textures, and Color histograms) and pretrained CNNs such as ResNet and MobileNet. It includes a FastAPI backend with TensorFlow Serving.</w:t>
-      </w:r>
-      <w:r>
-        <w:rPr>
-          <w:rFonts w:ascii="Arial" w:eastAsia="Times New Roman" w:hAnsi="Arial" w:cs="Arial"/>
-          <w:color w:val="0D0D0D" w:themeColor="text1" w:themeTint="F2"/>
+          <w:color w:val="auto"/>
+          <w:sz w:val="20"/>
+        </w:rPr>
+      </w:pPr>
+      <w:r>
+        <w:rPr>
+          <w:rFonts w:ascii="Arial" w:eastAsia="Times New Roman" w:hAnsi="Arial" w:cs="Arial"/>
+          <w:color w:val="auto"/>
+          <w:sz w:val="20"/>
+        </w:rPr>
+        <w:t xml:space="preserve">Research Assistant Bot (RAB) is a user-friendly research tool for retrieving information. Users can input article URLs or upload a PDF file and ask questions related to the content. It is built using </w:t>
+      </w:r>
+      <w:proofErr w:type="spellStart"/>
+      <w:r>
+        <w:rPr>
+          <w:rFonts w:ascii="Arial" w:eastAsia="Times New Roman" w:hAnsi="Arial" w:cs="Arial"/>
+          <w:color w:val="auto"/>
+          <w:sz w:val="20"/>
+        </w:rPr>
+        <w:t>Groq</w:t>
+      </w:r>
+      <w:proofErr w:type="spellEnd"/>
+      <w:r>
+        <w:rPr>
+          <w:rFonts w:ascii="Arial" w:eastAsia="Times New Roman" w:hAnsi="Arial" w:cs="Arial"/>
+          <w:color w:val="auto"/>
+          <w:sz w:val="20"/>
+        </w:rPr>
+        <w:t xml:space="preserve">, </w:t>
+      </w:r>
+      <w:proofErr w:type="spellStart"/>
+      <w:r>
+        <w:rPr>
+          <w:rFonts w:ascii="Arial" w:eastAsia="Times New Roman" w:hAnsi="Arial" w:cs="Arial"/>
+          <w:color w:val="auto"/>
+          <w:sz w:val="20"/>
+        </w:rPr>
+        <w:t>LangChain</w:t>
+      </w:r>
+      <w:proofErr w:type="spellEnd"/>
+      <w:r>
+        <w:rPr>
+          <w:rFonts w:ascii="Arial" w:eastAsia="Times New Roman" w:hAnsi="Arial" w:cs="Arial"/>
+          <w:color w:val="auto"/>
+          <w:sz w:val="20"/>
+        </w:rPr>
+        <w:t>, FAISS, Llama</w:t>
+      </w:r>
+      <w:r>
+        <w:rPr>
+          <w:rFonts w:ascii="Arial" w:eastAsia="Times New Roman" w:hAnsi="Arial" w:cs="Arial"/>
+          <w:color w:val="auto"/>
           <w:sz w:val="20"/>
         </w:rPr>
         <w:t xml:space="preserve"> </w:t>
@@ -2581,15 +2897,25 @@
       <w:r>
         <w:rPr>
           <w:rFonts w:ascii="Arial" w:eastAsia="Times New Roman" w:hAnsi="Arial" w:cs="Arial"/>
-          <w:color w:val="0D0D0D" w:themeColor="text1" w:themeTint="F2"/>
-          <w:sz w:val="20"/>
-        </w:rPr>
-        <w:t>The model is deployed on Google Cloud Platform (GCP) using Cloud Functions and Cloud Storage, with an additional Gradio interface for easy access on Hugging Face Spaces</w:t>
-      </w:r>
-      <w:r>
-        <w:rPr>
-          <w:rFonts w:ascii="Arial" w:eastAsia="Times New Roman" w:hAnsi="Arial" w:cs="Arial"/>
-          <w:color w:val="0D0D0D" w:themeColor="text1" w:themeTint="F2"/>
+          <w:color w:val="auto"/>
+          <w:sz w:val="20"/>
+        </w:rPr>
+        <w:t xml:space="preserve">3, and </w:t>
+      </w:r>
+      <w:proofErr w:type="spellStart"/>
+      <w:r>
+        <w:rPr>
+          <w:rFonts w:ascii="Arial" w:eastAsia="Times New Roman" w:hAnsi="Arial" w:cs="Arial"/>
+          <w:color w:val="auto"/>
+          <w:sz w:val="20"/>
+        </w:rPr>
+        <w:t>Streamlit</w:t>
+      </w:r>
+      <w:proofErr w:type="spellEnd"/>
+      <w:r>
+        <w:rPr>
+          <w:rFonts w:ascii="Arial" w:eastAsia="Times New Roman" w:hAnsi="Arial" w:cs="Arial"/>
+          <w:color w:val="auto"/>
           <w:sz w:val="20"/>
         </w:rPr>
         <w:t>.</w:t>
@@ -2614,7 +2940,7 @@
           <w:bCs/>
           <w:color w:val="0D0D0D" w:themeColor="text1" w:themeTint="F2"/>
         </w:rPr>
-        <w:t>Reachout Mail Generator_GenAI_LLM</w:t>
+        <w:t>Plant Disease Detection</w:t>
       </w:r>
       <w:r>
         <w:rPr>
@@ -2631,7 +2957,7 @@
           <w:color w:val="0D0D0D" w:themeColor="text1" w:themeTint="F2"/>
           <w:sz w:val="20"/>
         </w:rPr>
-        <w:t>1</w:t>
+        <w:t>10</w:t>
       </w:r>
       <w:r>
         <w:rPr>
@@ -2641,7 +2967,7 @@
           <w:color w:val="0D0D0D" w:themeColor="text1" w:themeTint="F2"/>
           <w:sz w:val="20"/>
         </w:rPr>
-        <w:t>1</w:t>
+        <w:t>/2024</w:t>
       </w:r>
       <w:r>
         <w:rPr>
@@ -2651,7 +2977,26 @@
           <w:color w:val="0D0D0D" w:themeColor="text1" w:themeTint="F2"/>
           <w:sz w:val="20"/>
         </w:rPr>
-        <w:t>/2024</w:t>
+        <w:t xml:space="preserve"> </w:t>
+      </w:r>
+      <w:r>
+        <w:rPr>
+          <w:rFonts w:ascii="Arial" w:hAnsi="Arial" w:cs="Arial"/>
+          <w:bCs/>
+          <w:color w:val="0D0D0D" w:themeColor="text1" w:themeTint="F2"/>
+          <w:sz w:val="20"/>
+        </w:rPr>
+        <w:t xml:space="preserve">– </w:t>
+      </w:r>
+      <w:r>
+        <w:rPr>
+          <w:rFonts w:ascii="Arial" w:hAnsi="Arial" w:cs="Arial"/>
+          <w:b w:val="0"/>
+          <w:bCs/>
+          <w:color w:val="0D0D0D" w:themeColor="text1" w:themeTint="F2"/>
+          <w:sz w:val="20"/>
+        </w:rPr>
+        <w:t>12/2024</w:t>
       </w:r>
     </w:p>
     <w:p>
@@ -2676,15 +3021,97 @@
           <w:color w:val="0D0D0D" w:themeColor="text1" w:themeTint="F2"/>
           <w:sz w:val="20"/>
         </w:rPr>
-        <w:t>Outreach Mail Generator is a tool that helps companies to generate outreach emails using Groq, LangChain,</w:t>
-      </w:r>
-      <w:r>
-        <w:rPr>
-          <w:rFonts w:ascii="Arial" w:eastAsia="Times New Roman" w:hAnsi="Arial" w:cs="Arial"/>
-          <w:color w:val="0D0D0D" w:themeColor="text1" w:themeTint="F2"/>
-          <w:sz w:val="20"/>
-        </w:rPr>
-        <w:t xml:space="preserve"> ChromaDB,</w:t>
+        <w:t xml:space="preserve">This plant disease detection system utilizes traditional ML methods like SVM and Random Forest with feature extraction techniques (Hu Moments, </w:t>
+      </w:r>
+      <w:proofErr w:type="spellStart"/>
+      <w:r>
+        <w:rPr>
+          <w:rFonts w:ascii="Arial" w:eastAsia="Times New Roman" w:hAnsi="Arial" w:cs="Arial"/>
+          <w:color w:val="0D0D0D" w:themeColor="text1" w:themeTint="F2"/>
+          <w:sz w:val="20"/>
+        </w:rPr>
+        <w:t>Haralick</w:t>
+      </w:r>
+      <w:proofErr w:type="spellEnd"/>
+      <w:r>
+        <w:rPr>
+          <w:rFonts w:ascii="Arial" w:eastAsia="Times New Roman" w:hAnsi="Arial" w:cs="Arial"/>
+          <w:color w:val="0D0D0D" w:themeColor="text1" w:themeTint="F2"/>
+          <w:sz w:val="20"/>
+        </w:rPr>
+        <w:t xml:space="preserve"> textures, and </w:t>
+      </w:r>
+      <w:proofErr w:type="spellStart"/>
+      <w:r>
+        <w:rPr>
+          <w:rFonts w:ascii="Arial" w:eastAsia="Times New Roman" w:hAnsi="Arial" w:cs="Arial"/>
+          <w:color w:val="0D0D0D" w:themeColor="text1" w:themeTint="F2"/>
+          <w:sz w:val="20"/>
+        </w:rPr>
+        <w:t>Color</w:t>
+      </w:r>
+      <w:proofErr w:type="spellEnd"/>
+      <w:r>
+        <w:rPr>
+          <w:rFonts w:ascii="Arial" w:eastAsia="Times New Roman" w:hAnsi="Arial" w:cs="Arial"/>
+          <w:color w:val="0D0D0D" w:themeColor="text1" w:themeTint="F2"/>
+          <w:sz w:val="20"/>
+        </w:rPr>
+        <w:t xml:space="preserve"> histograms) and pretrained CNNs such as </w:t>
+      </w:r>
+      <w:proofErr w:type="spellStart"/>
+      <w:r>
+        <w:rPr>
+          <w:rFonts w:ascii="Arial" w:eastAsia="Times New Roman" w:hAnsi="Arial" w:cs="Arial"/>
+          <w:color w:val="0D0D0D" w:themeColor="text1" w:themeTint="F2"/>
+          <w:sz w:val="20"/>
+        </w:rPr>
+        <w:t>ResNet</w:t>
+      </w:r>
+      <w:proofErr w:type="spellEnd"/>
+      <w:r>
+        <w:rPr>
+          <w:rFonts w:ascii="Arial" w:eastAsia="Times New Roman" w:hAnsi="Arial" w:cs="Arial"/>
+          <w:color w:val="0D0D0D" w:themeColor="text1" w:themeTint="F2"/>
+          <w:sz w:val="20"/>
+        </w:rPr>
+        <w:t xml:space="preserve"> and </w:t>
+      </w:r>
+      <w:proofErr w:type="spellStart"/>
+      <w:r>
+        <w:rPr>
+          <w:rFonts w:ascii="Arial" w:eastAsia="Times New Roman" w:hAnsi="Arial" w:cs="Arial"/>
+          <w:color w:val="0D0D0D" w:themeColor="text1" w:themeTint="F2"/>
+          <w:sz w:val="20"/>
+        </w:rPr>
+        <w:t>MobileNet</w:t>
+      </w:r>
+      <w:proofErr w:type="spellEnd"/>
+      <w:r>
+        <w:rPr>
+          <w:rFonts w:ascii="Arial" w:eastAsia="Times New Roman" w:hAnsi="Arial" w:cs="Arial"/>
+          <w:color w:val="0D0D0D" w:themeColor="text1" w:themeTint="F2"/>
+          <w:sz w:val="20"/>
+        </w:rPr>
+        <w:t xml:space="preserve">. It includes a </w:t>
+      </w:r>
+      <w:proofErr w:type="spellStart"/>
+      <w:r>
+        <w:rPr>
+          <w:rFonts w:ascii="Arial" w:eastAsia="Times New Roman" w:hAnsi="Arial" w:cs="Arial"/>
+          <w:color w:val="0D0D0D" w:themeColor="text1" w:themeTint="F2"/>
+          <w:sz w:val="20"/>
+        </w:rPr>
+        <w:t>FastAPI</w:t>
+      </w:r>
+      <w:proofErr w:type="spellEnd"/>
+      <w:r>
+        <w:rPr>
+          <w:rFonts w:ascii="Arial" w:eastAsia="Times New Roman" w:hAnsi="Arial" w:cs="Arial"/>
+          <w:color w:val="0D0D0D" w:themeColor="text1" w:themeTint="F2"/>
+          <w:sz w:val="20"/>
+        </w:rPr>
+        <w:t xml:space="preserve"> backend with TensorFlow Serving.</w:t>
       </w:r>
       <w:r>
         <w:rPr>
@@ -2700,6 +3127,214 @@
           <w:color w:val="0D0D0D" w:themeColor="text1" w:themeTint="F2"/>
           <w:sz w:val="20"/>
         </w:rPr>
+        <w:t xml:space="preserve">The model is deployed on Google Cloud Platform (GCP) using Cloud Functions and Cloud Storage, with an additional </w:t>
+      </w:r>
+      <w:proofErr w:type="spellStart"/>
+      <w:r>
+        <w:rPr>
+          <w:rFonts w:ascii="Arial" w:eastAsia="Times New Roman" w:hAnsi="Arial" w:cs="Arial"/>
+          <w:color w:val="0D0D0D" w:themeColor="text1" w:themeTint="F2"/>
+          <w:sz w:val="20"/>
+        </w:rPr>
+        <w:t>Gradio</w:t>
+      </w:r>
+      <w:proofErr w:type="spellEnd"/>
+      <w:r>
+        <w:rPr>
+          <w:rFonts w:ascii="Arial" w:eastAsia="Times New Roman" w:hAnsi="Arial" w:cs="Arial"/>
+          <w:color w:val="0D0D0D" w:themeColor="text1" w:themeTint="F2"/>
+          <w:sz w:val="20"/>
+        </w:rPr>
+        <w:t xml:space="preserve"> interface for easy access on Hugging Face Spaces</w:t>
+      </w:r>
+      <w:r>
+        <w:rPr>
+          <w:rFonts w:ascii="Arial" w:eastAsia="Times New Roman" w:hAnsi="Arial" w:cs="Arial"/>
+          <w:color w:val="0D0D0D" w:themeColor="text1" w:themeTint="F2"/>
+          <w:sz w:val="20"/>
+        </w:rPr>
+        <w:t>.</w:t>
+      </w:r>
+    </w:p>
+    <w:p>
+      <w:pPr>
+        <w:pStyle w:val="Heading1"/>
+        <w:tabs>
+          <w:tab w:val="right" w:pos="10695"/>
+        </w:tabs>
+        <w:spacing w:line="276" w:lineRule="auto"/>
+        <w:ind w:left="0" w:right="26" w:firstLine="0"/>
+        <w:rPr>
+          <w:rFonts w:ascii="Arial" w:hAnsi="Arial" w:cs="Arial"/>
+          <w:color w:val="0D0D0D" w:themeColor="text1" w:themeTint="F2"/>
+        </w:rPr>
+      </w:pPr>
+      <w:proofErr w:type="spellStart"/>
+      <w:r>
+        <w:rPr>
+          <w:rFonts w:ascii="Arial" w:hAnsi="Arial" w:cs="Arial"/>
+          <w:bCs/>
+          <w:color w:val="0D0D0D" w:themeColor="text1" w:themeTint="F2"/>
+        </w:rPr>
+        <w:t>Reachout</w:t>
+      </w:r>
+      <w:proofErr w:type="spellEnd"/>
+      <w:r>
+        <w:rPr>
+          <w:rFonts w:ascii="Arial" w:hAnsi="Arial" w:cs="Arial"/>
+          <w:bCs/>
+          <w:color w:val="0D0D0D" w:themeColor="text1" w:themeTint="F2"/>
+        </w:rPr>
+        <w:t xml:space="preserve"> Mail </w:t>
+      </w:r>
+      <w:proofErr w:type="spellStart"/>
+      <w:r>
+        <w:rPr>
+          <w:rFonts w:ascii="Arial" w:hAnsi="Arial" w:cs="Arial"/>
+          <w:bCs/>
+          <w:color w:val="0D0D0D" w:themeColor="text1" w:themeTint="F2"/>
+        </w:rPr>
+        <w:t>Generator_GenAI_LLM</w:t>
+      </w:r>
+      <w:proofErr w:type="spellEnd"/>
+      <w:r>
+        <w:rPr>
+          <w:rFonts w:ascii="Arial" w:hAnsi="Arial" w:cs="Arial"/>
+          <w:color w:val="0D0D0D" w:themeColor="text1" w:themeTint="F2"/>
+        </w:rPr>
+        <w:tab/>
+      </w:r>
+      <w:r>
+        <w:rPr>
+          <w:rFonts w:ascii="Arial" w:hAnsi="Arial" w:cs="Arial"/>
+          <w:b w:val="0"/>
+          <w:bCs/>
+          <w:color w:val="0D0D0D" w:themeColor="text1" w:themeTint="F2"/>
+          <w:sz w:val="20"/>
+        </w:rPr>
+        <w:t>1</w:t>
+      </w:r>
+      <w:r>
+        <w:rPr>
+          <w:rFonts w:ascii="Arial" w:hAnsi="Arial" w:cs="Arial"/>
+          <w:b w:val="0"/>
+          <w:bCs/>
+          <w:color w:val="0D0D0D" w:themeColor="text1" w:themeTint="F2"/>
+          <w:sz w:val="20"/>
+        </w:rPr>
+        <w:t>1</w:t>
+      </w:r>
+      <w:r>
+        <w:rPr>
+          <w:rFonts w:ascii="Arial" w:hAnsi="Arial" w:cs="Arial"/>
+          <w:b w:val="0"/>
+          <w:bCs/>
+          <w:color w:val="0D0D0D" w:themeColor="text1" w:themeTint="F2"/>
+          <w:sz w:val="20"/>
+        </w:rPr>
+        <w:t>/2024</w:t>
+      </w:r>
+    </w:p>
+    <w:p>
+      <w:pPr>
+        <w:pStyle w:val="ListParagraph"/>
+        <w:numPr>
+          <w:ilvl w:val="0"/>
+          <w:numId w:val="8"/>
+        </w:numPr>
+        <w:spacing w:after="30" w:line="276" w:lineRule="auto"/>
+        <w:ind w:left="284" w:right="26" w:hanging="284"/>
+        <w:jc w:val="both"/>
+        <w:rPr>
+          <w:rFonts w:ascii="Arial" w:eastAsia="Times New Roman" w:hAnsi="Arial" w:cs="Arial"/>
+          <w:color w:val="0D0D0D" w:themeColor="text1" w:themeTint="F2"/>
+          <w:sz w:val="20"/>
+        </w:rPr>
+      </w:pPr>
+      <w:r>
+        <w:rPr>
+          <w:rFonts w:ascii="Arial" w:eastAsia="Times New Roman" w:hAnsi="Arial" w:cs="Arial"/>
+          <w:color w:val="0D0D0D" w:themeColor="text1" w:themeTint="F2"/>
+          <w:sz w:val="20"/>
+        </w:rPr>
+        <w:t xml:space="preserve">Outreach Mail Generator is a tool that helps companies to generate outreach emails using </w:t>
+      </w:r>
+      <w:proofErr w:type="spellStart"/>
+      <w:r>
+        <w:rPr>
+          <w:rFonts w:ascii="Arial" w:eastAsia="Times New Roman" w:hAnsi="Arial" w:cs="Arial"/>
+          <w:color w:val="0D0D0D" w:themeColor="text1" w:themeTint="F2"/>
+          <w:sz w:val="20"/>
+        </w:rPr>
+        <w:t>Groq</w:t>
+      </w:r>
+      <w:proofErr w:type="spellEnd"/>
+      <w:r>
+        <w:rPr>
+          <w:rFonts w:ascii="Arial" w:eastAsia="Times New Roman" w:hAnsi="Arial" w:cs="Arial"/>
+          <w:color w:val="0D0D0D" w:themeColor="text1" w:themeTint="F2"/>
+          <w:sz w:val="20"/>
+        </w:rPr>
+        <w:t xml:space="preserve">, </w:t>
+      </w:r>
+      <w:proofErr w:type="spellStart"/>
+      <w:r>
+        <w:rPr>
+          <w:rFonts w:ascii="Arial" w:eastAsia="Times New Roman" w:hAnsi="Arial" w:cs="Arial"/>
+          <w:color w:val="0D0D0D" w:themeColor="text1" w:themeTint="F2"/>
+          <w:sz w:val="20"/>
+        </w:rPr>
+        <w:t>LangChain</w:t>
+      </w:r>
+      <w:proofErr w:type="spellEnd"/>
+      <w:r>
+        <w:rPr>
+          <w:rFonts w:ascii="Arial" w:eastAsia="Times New Roman" w:hAnsi="Arial" w:cs="Arial"/>
+          <w:color w:val="0D0D0D" w:themeColor="text1" w:themeTint="F2"/>
+          <w:sz w:val="20"/>
+        </w:rPr>
+        <w:t>,</w:t>
+      </w:r>
+      <w:r>
+        <w:rPr>
+          <w:rFonts w:ascii="Arial" w:eastAsia="Times New Roman" w:hAnsi="Arial" w:cs="Arial"/>
+          <w:color w:val="0D0D0D" w:themeColor="text1" w:themeTint="F2"/>
+          <w:sz w:val="20"/>
+        </w:rPr>
+        <w:t xml:space="preserve"> </w:t>
+      </w:r>
+      <w:proofErr w:type="spellStart"/>
+      <w:r>
+        <w:rPr>
+          <w:rFonts w:ascii="Arial" w:eastAsia="Times New Roman" w:hAnsi="Arial" w:cs="Arial"/>
+          <w:color w:val="0D0D0D" w:themeColor="text1" w:themeTint="F2"/>
+          <w:sz w:val="20"/>
+        </w:rPr>
+        <w:t>ChromaDB</w:t>
+      </w:r>
+      <w:proofErr w:type="spellEnd"/>
+      <w:r>
+        <w:rPr>
+          <w:rFonts w:ascii="Arial" w:eastAsia="Times New Roman" w:hAnsi="Arial" w:cs="Arial"/>
+          <w:color w:val="0D0D0D" w:themeColor="text1" w:themeTint="F2"/>
+          <w:sz w:val="20"/>
+        </w:rPr>
+        <w:t>,</w:t>
+      </w:r>
+      <w:r>
+        <w:rPr>
+          <w:rFonts w:ascii="Arial" w:eastAsia="Times New Roman" w:hAnsi="Arial" w:cs="Arial"/>
+          <w:color w:val="0D0D0D" w:themeColor="text1" w:themeTint="F2"/>
+          <w:sz w:val="20"/>
+        </w:rPr>
+        <w:t xml:space="preserve"> </w:t>
+      </w:r>
+      <w:r>
+        <w:rPr>
+          <w:rFonts w:ascii="Arial" w:eastAsia="Times New Roman" w:hAnsi="Arial" w:cs="Arial"/>
+          <w:color w:val="0D0D0D" w:themeColor="text1" w:themeTint="F2"/>
+          <w:sz w:val="20"/>
+        </w:rPr>
         <w:t>Llama</w:t>
       </w:r>
       <w:r>
@@ -2740,7 +3375,43 @@
           <w:color w:val="0D0D0D" w:themeColor="text1" w:themeTint="F2"/>
           <w:sz w:val="20"/>
         </w:rPr>
-        <w:t xml:space="preserve">and Streamlit/Gradio. It </w:t>
+        <w:t xml:space="preserve">and </w:t>
+      </w:r>
+      <w:proofErr w:type="spellStart"/>
+      <w:r>
+        <w:rPr>
+          <w:rFonts w:ascii="Arial" w:eastAsia="Times New Roman" w:hAnsi="Arial" w:cs="Arial"/>
+          <w:color w:val="0D0D0D" w:themeColor="text1" w:themeTint="F2"/>
+          <w:sz w:val="20"/>
+        </w:rPr>
+        <w:t>Streamlit</w:t>
+      </w:r>
+      <w:proofErr w:type="spellEnd"/>
+      <w:r>
+        <w:rPr>
+          <w:rFonts w:ascii="Arial" w:eastAsia="Times New Roman" w:hAnsi="Arial" w:cs="Arial"/>
+          <w:color w:val="0D0D0D" w:themeColor="text1" w:themeTint="F2"/>
+          <w:sz w:val="20"/>
+        </w:rPr>
+        <w:t>/</w:t>
+      </w:r>
+      <w:proofErr w:type="spellStart"/>
+      <w:r>
+        <w:rPr>
+          <w:rFonts w:ascii="Arial" w:eastAsia="Times New Roman" w:hAnsi="Arial" w:cs="Arial"/>
+          <w:color w:val="0D0D0D" w:themeColor="text1" w:themeTint="F2"/>
+          <w:sz w:val="20"/>
+        </w:rPr>
+        <w:t>Gradio</w:t>
+      </w:r>
+      <w:proofErr w:type="spellEnd"/>
+      <w:r>
+        <w:rPr>
+          <w:rFonts w:ascii="Arial" w:eastAsia="Times New Roman" w:hAnsi="Arial" w:cs="Arial"/>
+          <w:color w:val="0D0D0D" w:themeColor="text1" w:themeTint="F2"/>
+          <w:sz w:val="20"/>
+        </w:rPr>
+        <w:t xml:space="preserve">. It </w:t>
       </w:r>
       <w:r>
         <w:rPr>
@@ -2911,15 +3582,43 @@
           <w:color w:val="0D0D0D" w:themeColor="text1" w:themeTint="F2"/>
           <w:sz w:val="20"/>
         </w:rPr>
-        <w:t>Personal medical chatbot project using Large Language Models (LLM) and Retrieval Augmented Generation (RAG). The chatbot provides detailed answers by leveraging medical knowledge from PDF documents, employing LlamaCPP for LLM integration and llama_index for efficient document handling. This approach enhances natural language responses and enables advanced retrieval of health-related information.</w:t>
-      </w:r>
-      <w:r>
-        <w:rPr>
-          <w:rFonts w:ascii="Arial" w:eastAsia="Times New Roman" w:hAnsi="Arial" w:cs="Arial"/>
-          <w:color w:val="0D0D0D" w:themeColor="text1" w:themeTint="F2"/>
-          <w:sz w:val="20"/>
-        </w:rPr>
-        <w:t>.</w:t>
+        <w:t xml:space="preserve">Personal medical chatbot project using Large Language Models (LLM) and Retrieval Augmented Generation (RAG). The chatbot provides detailed answers by leveraging medical knowledge from PDF documents, employing </w:t>
+      </w:r>
+      <w:proofErr w:type="spellStart"/>
+      <w:r>
+        <w:rPr>
+          <w:rFonts w:ascii="Arial" w:eastAsia="Times New Roman" w:hAnsi="Arial" w:cs="Arial"/>
+          <w:color w:val="0D0D0D" w:themeColor="text1" w:themeTint="F2"/>
+          <w:sz w:val="20"/>
+        </w:rPr>
+        <w:t>LlamaCPP</w:t>
+      </w:r>
+      <w:proofErr w:type="spellEnd"/>
+      <w:r>
+        <w:rPr>
+          <w:rFonts w:ascii="Arial" w:eastAsia="Times New Roman" w:hAnsi="Arial" w:cs="Arial"/>
+          <w:color w:val="0D0D0D" w:themeColor="text1" w:themeTint="F2"/>
+          <w:sz w:val="20"/>
+        </w:rPr>
+        <w:t xml:space="preserve"> for LLM integration and </w:t>
+      </w:r>
+      <w:proofErr w:type="spellStart"/>
+      <w:r>
+        <w:rPr>
+          <w:rFonts w:ascii="Arial" w:eastAsia="Times New Roman" w:hAnsi="Arial" w:cs="Arial"/>
+          <w:color w:val="0D0D0D" w:themeColor="text1" w:themeTint="F2"/>
+          <w:sz w:val="20"/>
+        </w:rPr>
+        <w:t>llama_index</w:t>
+      </w:r>
+      <w:proofErr w:type="spellEnd"/>
+      <w:r>
+        <w:rPr>
+          <w:rFonts w:ascii="Arial" w:eastAsia="Times New Roman" w:hAnsi="Arial" w:cs="Arial"/>
+          <w:color w:val="0D0D0D" w:themeColor="text1" w:themeTint="F2"/>
+          <w:sz w:val="20"/>
+        </w:rPr>
+        <w:t xml:space="preserve"> for efficient document handling. This approach enhances natural language responses and enables advanced retrieval of health-related information.</w:t>
       </w:r>
     </w:p>
     <w:p>
@@ -3531,11 +4230,22 @@
       <w:r>
         <w:rPr>
           <w:rFonts w:ascii="Arial" w:eastAsia="Times New Roman" w:hAnsi="Arial" w:cs="Arial"/>
-          <w:color w:val="0D0D0D" w:themeColor="text1" w:themeTint="F2"/>
-          <w:sz w:val="20"/>
-          <w:szCs w:val="20"/>
-        </w:rPr>
-        <w:t>Programming: Python, SQL, C, Java</w:t>
+          <w:b/>
+          <w:bCs/>
+          <w:color w:val="0D0D0D" w:themeColor="text1" w:themeTint="F2"/>
+          <w:sz w:val="20"/>
+          <w:szCs w:val="20"/>
+        </w:rPr>
+        <w:t>Programming:</w:t>
+      </w:r>
+      <w:r>
+        <w:rPr>
+          <w:rFonts w:ascii="Arial" w:eastAsia="Times New Roman" w:hAnsi="Arial" w:cs="Arial"/>
+          <w:color w:val="0D0D0D" w:themeColor="text1" w:themeTint="F2"/>
+          <w:sz w:val="20"/>
+          <w:szCs w:val="20"/>
+        </w:rPr>
+        <w:t xml:space="preserve"> Python, SQL, C, Java</w:t>
       </w:r>
     </w:p>
     <w:p>
@@ -3556,12 +4266,34 @@
       <w:r>
         <w:rPr>
           <w:rFonts w:ascii="Arial" w:eastAsia="Times New Roman" w:hAnsi="Arial" w:cs="Arial"/>
-          <w:color w:val="0D0D0D" w:themeColor="text1" w:themeTint="F2"/>
-          <w:sz w:val="20"/>
-          <w:szCs w:val="20"/>
-        </w:rPr>
-        <w:t>Databases: MySQL, PostgreSQL</w:t>
-      </w:r>
+          <w:b/>
+          <w:bCs/>
+          <w:color w:val="0D0D0D" w:themeColor="text1" w:themeTint="F2"/>
+          <w:sz w:val="20"/>
+          <w:szCs w:val="20"/>
+        </w:rPr>
+        <w:t>GenAI, LLM, RAG &amp; Agents:</w:t>
+      </w:r>
+      <w:r>
+        <w:rPr>
+          <w:rFonts w:ascii="Arial" w:eastAsia="Times New Roman" w:hAnsi="Arial" w:cs="Arial"/>
+          <w:color w:val="0D0D0D" w:themeColor="text1" w:themeTint="F2"/>
+          <w:sz w:val="20"/>
+          <w:szCs w:val="20"/>
+        </w:rPr>
+        <w:t xml:space="preserve"> </w:t>
+      </w:r>
+      <w:proofErr w:type="spellStart"/>
+      <w:r>
+        <w:rPr>
+          <w:rFonts w:ascii="Arial" w:eastAsia="Times New Roman" w:hAnsi="Arial" w:cs="Arial"/>
+          <w:color w:val="0D0D0D" w:themeColor="text1" w:themeTint="F2"/>
+          <w:sz w:val="20"/>
+          <w:szCs w:val="20"/>
+        </w:rPr>
+        <w:t>LangChain</w:t>
+      </w:r>
+      <w:proofErr w:type="spellEnd"/>
       <w:r>
         <w:rPr>
           <w:rFonts w:ascii="Arial" w:eastAsia="Times New Roman" w:hAnsi="Arial" w:cs="Arial"/>
@@ -3571,14 +4303,65 @@
         </w:rPr>
         <w:t xml:space="preserve">, </w:t>
       </w:r>
-      <w:r>
-        <w:rPr>
-          <w:rFonts w:ascii="Arial" w:eastAsia="Times New Roman" w:hAnsi="Arial" w:cs="Arial"/>
-          <w:color w:val="0D0D0D" w:themeColor="text1" w:themeTint="F2"/>
-          <w:sz w:val="20"/>
-          <w:szCs w:val="20"/>
-        </w:rPr>
-        <w:t>Supabase (Postgres BaaS)</w:t>
+      <w:proofErr w:type="spellStart"/>
+      <w:r>
+        <w:rPr>
+          <w:rFonts w:ascii="Arial" w:eastAsia="Times New Roman" w:hAnsi="Arial" w:cs="Arial"/>
+          <w:color w:val="0D0D0D" w:themeColor="text1" w:themeTint="F2"/>
+          <w:sz w:val="20"/>
+          <w:szCs w:val="20"/>
+        </w:rPr>
+        <w:t>LangGraph</w:t>
+      </w:r>
+      <w:proofErr w:type="spellEnd"/>
+      <w:r>
+        <w:rPr>
+          <w:rFonts w:ascii="Arial" w:eastAsia="Times New Roman" w:hAnsi="Arial" w:cs="Arial"/>
+          <w:color w:val="0D0D0D" w:themeColor="text1" w:themeTint="F2"/>
+          <w:sz w:val="20"/>
+          <w:szCs w:val="20"/>
+        </w:rPr>
+        <w:t xml:space="preserve">, </w:t>
+      </w:r>
+      <w:proofErr w:type="spellStart"/>
+      <w:r>
+        <w:rPr>
+          <w:rFonts w:ascii="Arial" w:eastAsia="Times New Roman" w:hAnsi="Arial" w:cs="Arial"/>
+          <w:color w:val="0D0D0D" w:themeColor="text1" w:themeTint="F2"/>
+          <w:sz w:val="20"/>
+          <w:szCs w:val="20"/>
+        </w:rPr>
+        <w:t>CrewAI</w:t>
+      </w:r>
+      <w:proofErr w:type="spellEnd"/>
+      <w:r>
+        <w:rPr>
+          <w:rFonts w:ascii="Arial" w:eastAsia="Times New Roman" w:hAnsi="Arial" w:cs="Arial"/>
+          <w:color w:val="0D0D0D" w:themeColor="text1" w:themeTint="F2"/>
+          <w:sz w:val="20"/>
+          <w:szCs w:val="20"/>
+        </w:rPr>
+        <w:t xml:space="preserve">, </w:t>
+      </w:r>
+      <w:proofErr w:type="spellStart"/>
+      <w:r>
+        <w:rPr>
+          <w:rFonts w:ascii="Arial" w:eastAsia="Times New Roman" w:hAnsi="Arial" w:cs="Arial"/>
+          <w:color w:val="0D0D0D" w:themeColor="text1" w:themeTint="F2"/>
+          <w:sz w:val="20"/>
+          <w:szCs w:val="20"/>
+        </w:rPr>
+        <w:t>LlamaIndex</w:t>
+      </w:r>
+      <w:proofErr w:type="spellEnd"/>
+      <w:r>
+        <w:rPr>
+          <w:rFonts w:ascii="Arial" w:eastAsia="Times New Roman" w:hAnsi="Arial" w:cs="Arial"/>
+          <w:color w:val="0D0D0D" w:themeColor="text1" w:themeTint="F2"/>
+          <w:sz w:val="20"/>
+          <w:szCs w:val="20"/>
+        </w:rPr>
+        <w:t>, Google ADK, prompt engineering, LLM-as-judge evaluation</w:t>
       </w:r>
     </w:p>
     <w:p>
@@ -3599,11 +4382,62 @@
       <w:r>
         <w:rPr>
           <w:rFonts w:ascii="Arial" w:eastAsia="Times New Roman" w:hAnsi="Arial" w:cs="Arial"/>
-          <w:color w:val="0D0D0D" w:themeColor="text1" w:themeTint="F2"/>
-          <w:sz w:val="20"/>
-          <w:szCs w:val="20"/>
-        </w:rPr>
-        <w:t>Data Visualization</w:t>
+          <w:b/>
+          <w:bCs/>
+          <w:color w:val="0D0D0D" w:themeColor="text1" w:themeTint="F2"/>
+          <w:sz w:val="20"/>
+          <w:szCs w:val="20"/>
+        </w:rPr>
+        <w:t>Vector Databases:</w:t>
+      </w:r>
+      <w:r>
+        <w:rPr>
+          <w:rFonts w:ascii="Arial" w:eastAsia="Times New Roman" w:hAnsi="Arial" w:cs="Arial"/>
+          <w:color w:val="0D0D0D" w:themeColor="text1" w:themeTint="F2"/>
+          <w:sz w:val="20"/>
+          <w:szCs w:val="20"/>
+        </w:rPr>
+        <w:t xml:space="preserve"> </w:t>
+      </w:r>
+      <w:proofErr w:type="spellStart"/>
+      <w:r>
+        <w:rPr>
+          <w:rFonts w:ascii="Arial" w:eastAsia="Times New Roman" w:hAnsi="Arial" w:cs="Arial"/>
+          <w:color w:val="0D0D0D" w:themeColor="text1" w:themeTint="F2"/>
+          <w:sz w:val="20"/>
+          <w:szCs w:val="20"/>
+        </w:rPr>
+        <w:t>Qdrant</w:t>
+      </w:r>
+      <w:proofErr w:type="spellEnd"/>
+      <w:r>
+        <w:rPr>
+          <w:rFonts w:ascii="Arial" w:eastAsia="Times New Roman" w:hAnsi="Arial" w:cs="Arial"/>
+          <w:color w:val="0D0D0D" w:themeColor="text1" w:themeTint="F2"/>
+          <w:sz w:val="20"/>
+          <w:szCs w:val="20"/>
+        </w:rPr>
+        <w:t xml:space="preserve">, Milvus, </w:t>
+      </w:r>
+      <w:proofErr w:type="spellStart"/>
+      <w:r>
+        <w:rPr>
+          <w:rFonts w:ascii="Arial" w:eastAsia="Times New Roman" w:hAnsi="Arial" w:cs="Arial"/>
+          <w:color w:val="0D0D0D" w:themeColor="text1" w:themeTint="F2"/>
+          <w:sz w:val="20"/>
+          <w:szCs w:val="20"/>
+        </w:rPr>
+        <w:t>ChromaDB</w:t>
+      </w:r>
+      <w:proofErr w:type="spellEnd"/>
+      <w:r>
+        <w:rPr>
+          <w:rFonts w:ascii="Arial" w:eastAsia="Times New Roman" w:hAnsi="Arial" w:cs="Arial"/>
+          <w:color w:val="0D0D0D" w:themeColor="text1" w:themeTint="F2"/>
+          <w:sz w:val="20"/>
+          <w:szCs w:val="20"/>
+        </w:rPr>
+        <w:t>, FAISS</w:t>
       </w:r>
     </w:p>
     <w:p>
@@ -3624,56 +4458,13 @@
       <w:r>
         <w:rPr>
           <w:rFonts w:ascii="Arial" w:eastAsia="Times New Roman" w:hAnsi="Arial" w:cs="Arial"/>
-          <w:color w:val="0D0D0D" w:themeColor="text1" w:themeTint="F2"/>
-          <w:sz w:val="20"/>
-          <w:szCs w:val="20"/>
-        </w:rPr>
-        <w:t>GenAI</w:t>
-      </w:r>
-      <w:r>
-        <w:rPr>
-          <w:rFonts w:ascii="Arial" w:eastAsia="Times New Roman" w:hAnsi="Arial" w:cs="Arial"/>
-          <w:color w:val="0D0D0D" w:themeColor="text1" w:themeTint="F2"/>
-          <w:sz w:val="20"/>
-          <w:szCs w:val="20"/>
-        </w:rPr>
-        <w:t xml:space="preserve">, </w:t>
-      </w:r>
-      <w:r>
-        <w:rPr>
-          <w:rFonts w:ascii="Arial" w:eastAsia="Times New Roman" w:hAnsi="Arial" w:cs="Arial"/>
-          <w:color w:val="0D0D0D" w:themeColor="text1" w:themeTint="F2"/>
-          <w:sz w:val="20"/>
-          <w:szCs w:val="20"/>
-        </w:rPr>
-        <w:t>LLM</w:t>
-      </w:r>
-      <w:r>
-        <w:rPr>
-          <w:rFonts w:ascii="Arial" w:eastAsia="Times New Roman" w:hAnsi="Arial" w:cs="Arial"/>
-          <w:color w:val="0D0D0D" w:themeColor="text1" w:themeTint="F2"/>
-          <w:sz w:val="20"/>
-          <w:szCs w:val="20"/>
-        </w:rPr>
-        <w:t xml:space="preserve">, RAG &amp; </w:t>
-      </w:r>
-      <w:r>
-        <w:rPr>
-          <w:rFonts w:ascii="Arial" w:eastAsia="Times New Roman" w:hAnsi="Arial" w:cs="Arial"/>
-          <w:color w:val="0D0D0D" w:themeColor="text1" w:themeTint="F2"/>
-          <w:sz w:val="20"/>
-          <w:szCs w:val="20"/>
-        </w:rPr>
-        <w:t>Agents</w:t>
-      </w:r>
-      <w:r>
-        <w:rPr>
-          <w:rFonts w:ascii="Arial" w:eastAsia="Times New Roman" w:hAnsi="Arial" w:cs="Arial"/>
-          <w:color w:val="0D0D0D" w:themeColor="text1" w:themeTint="F2"/>
-          <w:sz w:val="20"/>
-          <w:szCs w:val="20"/>
-        </w:rPr>
-        <w:t>: LangChain,</w:t>
+          <w:b/>
+          <w:bCs/>
+          <w:color w:val="0D0D0D" w:themeColor="text1" w:themeTint="F2"/>
+          <w:sz w:val="20"/>
+          <w:szCs w:val="20"/>
+        </w:rPr>
+        <w:t>Models:</w:t>
       </w:r>
       <w:r>
         <w:rPr>
@@ -3691,43 +4482,7 @@
           <w:sz w:val="20"/>
           <w:szCs w:val="20"/>
         </w:rPr>
-        <w:t>LangGraph,</w:t>
-      </w:r>
-      <w:r>
-        <w:rPr>
-          <w:rFonts w:ascii="Arial" w:eastAsia="Times New Roman" w:hAnsi="Arial" w:cs="Arial"/>
-          <w:color w:val="0D0D0D" w:themeColor="text1" w:themeTint="F2"/>
-          <w:sz w:val="20"/>
-          <w:szCs w:val="20"/>
-        </w:rPr>
-        <w:t xml:space="preserve"> CrewAI, </w:t>
-      </w:r>
-      <w:r>
-        <w:rPr>
-          <w:rFonts w:ascii="Arial" w:eastAsia="Times New Roman" w:hAnsi="Arial" w:cs="Arial"/>
-          <w:color w:val="0D0D0D" w:themeColor="text1" w:themeTint="F2"/>
-          <w:sz w:val="20"/>
-          <w:szCs w:val="20"/>
-        </w:rPr>
-        <w:t xml:space="preserve">LlamaIndex, </w:t>
-      </w:r>
-      <w:r>
-        <w:rPr>
-          <w:rFonts w:ascii="Arial" w:eastAsia="Times New Roman" w:hAnsi="Arial" w:cs="Arial"/>
-          <w:color w:val="0D0D0D" w:themeColor="text1" w:themeTint="F2"/>
-          <w:sz w:val="20"/>
-          <w:szCs w:val="20"/>
-        </w:rPr>
-        <w:t xml:space="preserve">Milvus, </w:t>
-      </w:r>
-      <w:r>
-        <w:rPr>
-          <w:rFonts w:ascii="Arial" w:eastAsia="Times New Roman" w:hAnsi="Arial" w:cs="Arial"/>
-          <w:color w:val="0D0D0D" w:themeColor="text1" w:themeTint="F2"/>
-          <w:sz w:val="20"/>
-          <w:szCs w:val="20"/>
-        </w:rPr>
-        <w:t>ChromaDB, FAISS</w:t>
+        <w:t>Gemini (Vertex AI), Claude (AWS Bedrock), GPT (OpenAI), DeepSeek, Llama, Qwen3-VL, Kimi K2.5, Nova</w:t>
       </w:r>
     </w:p>
     <w:p>
@@ -3748,29 +4503,139 @@
       <w:r>
         <w:rPr>
           <w:rFonts w:ascii="Arial" w:eastAsia="Times New Roman" w:hAnsi="Arial" w:cs="Arial"/>
-          <w:color w:val="0D0D0D" w:themeColor="text1" w:themeTint="F2"/>
-          <w:sz w:val="20"/>
-          <w:szCs w:val="20"/>
-        </w:rPr>
-        <w:t xml:space="preserve">Machine Learning: </w:t>
-      </w:r>
-      <w:r>
-        <w:rPr>
-          <w:rFonts w:ascii="Arial" w:eastAsia="Times New Roman" w:hAnsi="Arial" w:cs="Arial"/>
-          <w:color w:val="0D0D0D" w:themeColor="text1" w:themeTint="F2"/>
-          <w:sz w:val="20"/>
-          <w:szCs w:val="20"/>
-        </w:rPr>
-        <w:t>ML</w:t>
-      </w:r>
-      <w:r>
-        <w:rPr>
-          <w:rFonts w:ascii="Arial" w:eastAsia="Times New Roman" w:hAnsi="Arial" w:cs="Arial"/>
-          <w:color w:val="0D0D0D" w:themeColor="text1" w:themeTint="F2"/>
-          <w:sz w:val="20"/>
-          <w:szCs w:val="20"/>
-        </w:rPr>
-        <w:t xml:space="preserve"> Algorithms and Techniques</w:t>
+          <w:b/>
+          <w:bCs/>
+          <w:color w:val="0D0D0D" w:themeColor="text1" w:themeTint="F2"/>
+          <w:sz w:val="20"/>
+          <w:szCs w:val="20"/>
+        </w:rPr>
+        <w:lastRenderedPageBreak/>
+        <w:t>LLM Serving &amp; Infrastructure:</w:t>
+      </w:r>
+      <w:r>
+        <w:rPr>
+          <w:rFonts w:ascii="Arial" w:eastAsia="Times New Roman" w:hAnsi="Arial" w:cs="Arial"/>
+          <w:color w:val="0D0D0D" w:themeColor="text1" w:themeTint="F2"/>
+          <w:sz w:val="20"/>
+          <w:szCs w:val="20"/>
+        </w:rPr>
+        <w:t xml:space="preserve"> </w:t>
+      </w:r>
+      <w:proofErr w:type="spellStart"/>
+      <w:r>
+        <w:rPr>
+          <w:rFonts w:ascii="Arial" w:eastAsia="Times New Roman" w:hAnsi="Arial" w:cs="Arial"/>
+          <w:color w:val="0D0D0D" w:themeColor="text1" w:themeTint="F2"/>
+          <w:sz w:val="20"/>
+          <w:szCs w:val="20"/>
+        </w:rPr>
+        <w:t>vLLM</w:t>
+      </w:r>
+      <w:proofErr w:type="spellEnd"/>
+      <w:r>
+        <w:rPr>
+          <w:rFonts w:ascii="Arial" w:eastAsia="Times New Roman" w:hAnsi="Arial" w:cs="Arial"/>
+          <w:color w:val="0D0D0D" w:themeColor="text1" w:themeTint="F2"/>
+          <w:sz w:val="20"/>
+          <w:szCs w:val="20"/>
+        </w:rPr>
+        <w:t xml:space="preserve">, </w:t>
+      </w:r>
+      <w:proofErr w:type="spellStart"/>
+      <w:r>
+        <w:rPr>
+          <w:rFonts w:ascii="Arial" w:eastAsia="Times New Roman" w:hAnsi="Arial" w:cs="Arial"/>
+          <w:color w:val="0D0D0D" w:themeColor="text1" w:themeTint="F2"/>
+          <w:sz w:val="20"/>
+          <w:szCs w:val="20"/>
+        </w:rPr>
+        <w:t>SGLang</w:t>
+      </w:r>
+      <w:proofErr w:type="spellEnd"/>
+      <w:r>
+        <w:rPr>
+          <w:rFonts w:ascii="Arial" w:eastAsia="Times New Roman" w:hAnsi="Arial" w:cs="Arial"/>
+          <w:color w:val="0D0D0D" w:themeColor="text1" w:themeTint="F2"/>
+          <w:sz w:val="20"/>
+          <w:szCs w:val="20"/>
+        </w:rPr>
+        <w:t>, Ollama,</w:t>
+      </w:r>
+      <w:r>
+        <w:rPr>
+          <w:rFonts w:ascii="Arial" w:eastAsia="Times New Roman" w:hAnsi="Arial" w:cs="Arial"/>
+          <w:color w:val="0D0D0D" w:themeColor="text1" w:themeTint="F2"/>
+          <w:sz w:val="20"/>
+          <w:szCs w:val="20"/>
+        </w:rPr>
+        <w:t xml:space="preserve"> </w:t>
+      </w:r>
+      <w:proofErr w:type="spellStart"/>
+      <w:r>
+        <w:rPr>
+          <w:rFonts w:ascii="Arial" w:eastAsia="Times New Roman" w:hAnsi="Arial" w:cs="Arial"/>
+          <w:color w:val="0D0D0D" w:themeColor="text1" w:themeTint="F2"/>
+          <w:sz w:val="20"/>
+          <w:szCs w:val="20"/>
+        </w:rPr>
+        <w:t>LiveKit</w:t>
+      </w:r>
+      <w:proofErr w:type="spellEnd"/>
+      <w:r>
+        <w:rPr>
+          <w:rFonts w:ascii="Arial" w:eastAsia="Times New Roman" w:hAnsi="Arial" w:cs="Arial"/>
+          <w:color w:val="0D0D0D" w:themeColor="text1" w:themeTint="F2"/>
+          <w:sz w:val="20"/>
+          <w:szCs w:val="20"/>
+        </w:rPr>
+        <w:t xml:space="preserve">, </w:t>
+      </w:r>
+      <w:proofErr w:type="spellStart"/>
+      <w:r>
+        <w:rPr>
+          <w:rFonts w:ascii="Arial" w:eastAsia="Times New Roman" w:hAnsi="Arial" w:cs="Arial"/>
+          <w:color w:val="0D0D0D" w:themeColor="text1" w:themeTint="F2"/>
+          <w:sz w:val="20"/>
+          <w:szCs w:val="20"/>
+        </w:rPr>
+        <w:t>Pipecat</w:t>
+      </w:r>
+      <w:proofErr w:type="spellEnd"/>
+      <w:r>
+        <w:rPr>
+          <w:rFonts w:ascii="Arial" w:eastAsia="Times New Roman" w:hAnsi="Arial" w:cs="Arial"/>
+          <w:color w:val="0D0D0D" w:themeColor="text1" w:themeTint="F2"/>
+          <w:sz w:val="20"/>
+          <w:szCs w:val="20"/>
+        </w:rPr>
+        <w:t>,</w:t>
+      </w:r>
+      <w:r>
+        <w:rPr>
+          <w:rFonts w:ascii="Arial" w:eastAsia="Times New Roman" w:hAnsi="Arial" w:cs="Arial"/>
+          <w:color w:val="0D0D0D" w:themeColor="text1" w:themeTint="F2"/>
+          <w:sz w:val="20"/>
+          <w:szCs w:val="20"/>
+        </w:rPr>
+        <w:t xml:space="preserve"> self-hosted GPU deployment, real-time voice pipelines</w:t>
+      </w:r>
+      <w:r>
+        <w:rPr>
+          <w:rFonts w:ascii="Arial" w:eastAsia="Times New Roman" w:hAnsi="Arial" w:cs="Arial"/>
+          <w:color w:val="0D0D0D" w:themeColor="text1" w:themeTint="F2"/>
+          <w:sz w:val="20"/>
+          <w:szCs w:val="20"/>
+        </w:rPr>
+        <w:t xml:space="preserve"> </w:t>
+      </w:r>
+      <w:r>
+        <w:rPr>
+          <w:rFonts w:ascii="Arial" w:eastAsia="Times New Roman" w:hAnsi="Arial" w:cs="Arial"/>
+          <w:color w:val="0D0D0D" w:themeColor="text1" w:themeTint="F2"/>
+          <w:sz w:val="20"/>
+          <w:szCs w:val="20"/>
+        </w:rPr>
+        <w:t>(ASR → LLM → TTS)</w:t>
       </w:r>
     </w:p>
     <w:p>
@@ -3791,11 +4656,42 @@
       <w:r>
         <w:rPr>
           <w:rFonts w:ascii="Arial" w:eastAsia="Times New Roman" w:hAnsi="Arial" w:cs="Arial"/>
-          <w:color w:val="0D0D0D" w:themeColor="text1" w:themeTint="F2"/>
-          <w:sz w:val="20"/>
-          <w:szCs w:val="20"/>
-        </w:rPr>
-        <w:t>Deep Learning: Tensorflow, Keras</w:t>
+          <w:b/>
+          <w:bCs/>
+          <w:color w:val="0D0D0D" w:themeColor="text1" w:themeTint="F2"/>
+          <w:sz w:val="20"/>
+          <w:szCs w:val="20"/>
+        </w:rPr>
+        <w:t>Backend:</w:t>
+      </w:r>
+      <w:r>
+        <w:rPr>
+          <w:rFonts w:ascii="Arial" w:eastAsia="Times New Roman" w:hAnsi="Arial" w:cs="Arial"/>
+          <w:color w:val="0D0D0D" w:themeColor="text1" w:themeTint="F2"/>
+          <w:sz w:val="20"/>
+          <w:szCs w:val="20"/>
+        </w:rPr>
+        <w:t xml:space="preserve"> </w:t>
+      </w:r>
+      <w:proofErr w:type="spellStart"/>
+      <w:r>
+        <w:rPr>
+          <w:rFonts w:ascii="Arial" w:eastAsia="Times New Roman" w:hAnsi="Arial" w:cs="Arial"/>
+          <w:color w:val="0D0D0D" w:themeColor="text1" w:themeTint="F2"/>
+          <w:sz w:val="20"/>
+          <w:szCs w:val="20"/>
+        </w:rPr>
+        <w:t>FastAPI</w:t>
+      </w:r>
+      <w:proofErr w:type="spellEnd"/>
+      <w:r>
+        <w:rPr>
+          <w:rFonts w:ascii="Arial" w:eastAsia="Times New Roman" w:hAnsi="Arial" w:cs="Arial"/>
+          <w:color w:val="0D0D0D" w:themeColor="text1" w:themeTint="F2"/>
+          <w:sz w:val="20"/>
+          <w:szCs w:val="20"/>
+        </w:rPr>
+        <w:t>, Flask, Celery</w:t>
       </w:r>
     </w:p>
     <w:p>
@@ -3816,11 +4712,42 @@
       <w:r>
         <w:rPr>
           <w:rFonts w:ascii="Arial" w:eastAsia="Times New Roman" w:hAnsi="Arial" w:cs="Arial"/>
-          <w:color w:val="0D0D0D" w:themeColor="text1" w:themeTint="F2"/>
-          <w:sz w:val="20"/>
-          <w:szCs w:val="20"/>
-        </w:rPr>
-        <w:t>Natural Language Processing (NLP)</w:t>
+          <w:b/>
+          <w:bCs/>
+          <w:color w:val="0D0D0D" w:themeColor="text1" w:themeTint="F2"/>
+          <w:sz w:val="20"/>
+          <w:szCs w:val="20"/>
+        </w:rPr>
+        <w:t>Databases:</w:t>
+      </w:r>
+      <w:r>
+        <w:rPr>
+          <w:rFonts w:ascii="Arial" w:eastAsia="Times New Roman" w:hAnsi="Arial" w:cs="Arial"/>
+          <w:color w:val="0D0D0D" w:themeColor="text1" w:themeTint="F2"/>
+          <w:sz w:val="20"/>
+          <w:szCs w:val="20"/>
+        </w:rPr>
+        <w:t xml:space="preserve"> MySQL, PostgreSQL (Neon, </w:t>
+      </w:r>
+      <w:proofErr w:type="spellStart"/>
+      <w:r>
+        <w:rPr>
+          <w:rFonts w:ascii="Arial" w:eastAsia="Times New Roman" w:hAnsi="Arial" w:cs="Arial"/>
+          <w:color w:val="0D0D0D" w:themeColor="text1" w:themeTint="F2"/>
+          <w:sz w:val="20"/>
+          <w:szCs w:val="20"/>
+        </w:rPr>
+        <w:t>Supabase</w:t>
+      </w:r>
+      <w:proofErr w:type="spellEnd"/>
+      <w:r>
+        <w:rPr>
+          <w:rFonts w:ascii="Arial" w:eastAsia="Times New Roman" w:hAnsi="Arial" w:cs="Arial"/>
+          <w:color w:val="0D0D0D" w:themeColor="text1" w:themeTint="F2"/>
+          <w:sz w:val="20"/>
+          <w:szCs w:val="20"/>
+        </w:rPr>
+        <w:t>)</w:t>
       </w:r>
     </w:p>
     <w:p>
@@ -3841,11 +4768,62 @@
       <w:r>
         <w:rPr>
           <w:rFonts w:ascii="Arial" w:eastAsia="Times New Roman" w:hAnsi="Arial" w:cs="Arial"/>
-          <w:color w:val="0D0D0D" w:themeColor="text1" w:themeTint="F2"/>
-          <w:sz w:val="20"/>
-          <w:szCs w:val="20"/>
-        </w:rPr>
-        <w:t>MLflow</w:t>
+          <w:b/>
+          <w:bCs/>
+          <w:color w:val="0D0D0D" w:themeColor="text1" w:themeTint="F2"/>
+          <w:sz w:val="20"/>
+          <w:szCs w:val="20"/>
+        </w:rPr>
+        <w:t>Machine Learning &amp; Deep Learning:</w:t>
+      </w:r>
+      <w:r>
+        <w:rPr>
+          <w:rFonts w:ascii="Arial" w:eastAsia="Times New Roman" w:hAnsi="Arial" w:cs="Arial"/>
+          <w:color w:val="0D0D0D" w:themeColor="text1" w:themeTint="F2"/>
+          <w:sz w:val="20"/>
+          <w:szCs w:val="20"/>
+        </w:rPr>
+        <w:t xml:space="preserve"> ML algorithms and techniques, </w:t>
+      </w:r>
+      <w:proofErr w:type="spellStart"/>
+      <w:r>
+        <w:rPr>
+          <w:rFonts w:ascii="Arial" w:eastAsia="Times New Roman" w:hAnsi="Arial" w:cs="Arial"/>
+          <w:color w:val="0D0D0D" w:themeColor="text1" w:themeTint="F2"/>
+          <w:sz w:val="20"/>
+          <w:szCs w:val="20"/>
+        </w:rPr>
+        <w:t>PyTorch</w:t>
+      </w:r>
+      <w:proofErr w:type="spellEnd"/>
+      <w:r>
+        <w:rPr>
+          <w:rFonts w:ascii="Arial" w:eastAsia="Times New Roman" w:hAnsi="Arial" w:cs="Arial"/>
+          <w:color w:val="0D0D0D" w:themeColor="text1" w:themeTint="F2"/>
+          <w:sz w:val="20"/>
+          <w:szCs w:val="20"/>
+        </w:rPr>
+        <w:t xml:space="preserve">, TensorFlow, </w:t>
+      </w:r>
+      <w:proofErr w:type="spellStart"/>
+      <w:r>
+        <w:rPr>
+          <w:rFonts w:ascii="Arial" w:eastAsia="Times New Roman" w:hAnsi="Arial" w:cs="Arial"/>
+          <w:color w:val="0D0D0D" w:themeColor="text1" w:themeTint="F2"/>
+          <w:sz w:val="20"/>
+          <w:szCs w:val="20"/>
+        </w:rPr>
+        <w:t>Keras</w:t>
+      </w:r>
+      <w:proofErr w:type="spellEnd"/>
+      <w:r>
+        <w:rPr>
+          <w:rFonts w:ascii="Arial" w:eastAsia="Times New Roman" w:hAnsi="Arial" w:cs="Arial"/>
+          <w:color w:val="0D0D0D" w:themeColor="text1" w:themeTint="F2"/>
+          <w:sz w:val="20"/>
+          <w:szCs w:val="20"/>
+        </w:rPr>
+        <w:t>, NLP</w:t>
       </w:r>
     </w:p>
     <w:p>
@@ -3866,29 +4844,22 @@
       <w:r>
         <w:rPr>
           <w:rFonts w:ascii="Arial" w:eastAsia="Times New Roman" w:hAnsi="Arial" w:cs="Arial"/>
-          <w:color w:val="0D0D0D" w:themeColor="text1" w:themeTint="F2"/>
-          <w:sz w:val="20"/>
-          <w:szCs w:val="20"/>
-        </w:rPr>
-        <w:t>Git/</w:t>
-      </w:r>
-      <w:r>
-        <w:rPr>
-          <w:rFonts w:ascii="Arial" w:eastAsia="Times New Roman" w:hAnsi="Arial" w:cs="Arial"/>
-          <w:color w:val="0D0D0D" w:themeColor="text1" w:themeTint="F2"/>
-          <w:sz w:val="20"/>
-          <w:szCs w:val="20"/>
-        </w:rPr>
-        <w:t>GitHub</w:t>
-      </w:r>
-      <w:r>
-        <w:rPr>
-          <w:rFonts w:ascii="Arial" w:eastAsia="Times New Roman" w:hAnsi="Arial" w:cs="Arial"/>
-          <w:color w:val="0D0D0D" w:themeColor="text1" w:themeTint="F2"/>
-          <w:sz w:val="20"/>
-          <w:szCs w:val="20"/>
-        </w:rPr>
-        <w:t>/DagsHub</w:t>
+          <w:b/>
+          <w:bCs/>
+          <w:color w:val="0D0D0D" w:themeColor="text1" w:themeTint="F2"/>
+          <w:sz w:val="20"/>
+          <w:szCs w:val="20"/>
+        </w:rPr>
+        <w:t>Computer Vision:</w:t>
+      </w:r>
+      <w:r>
+        <w:rPr>
+          <w:rFonts w:ascii="Arial" w:eastAsia="Times New Roman" w:hAnsi="Arial" w:cs="Arial"/>
+          <w:color w:val="0D0D0D" w:themeColor="text1" w:themeTint="F2"/>
+          <w:sz w:val="20"/>
+          <w:szCs w:val="20"/>
+        </w:rPr>
+        <w:t xml:space="preserve"> OpenCV, scikit-image</w:t>
       </w:r>
     </w:p>
     <w:p>
@@ -3909,20 +4880,62 @@
       <w:r>
         <w:rPr>
           <w:rFonts w:ascii="Arial" w:eastAsia="Times New Roman" w:hAnsi="Arial" w:cs="Arial"/>
-          <w:color w:val="0D0D0D" w:themeColor="text1" w:themeTint="F2"/>
-          <w:sz w:val="20"/>
-          <w:szCs w:val="20"/>
-        </w:rPr>
-        <w:t>FastAPI</w:t>
-      </w:r>
-      <w:r>
-        <w:rPr>
-          <w:rFonts w:ascii="Arial" w:eastAsia="Times New Roman" w:hAnsi="Arial" w:cs="Arial"/>
-          <w:color w:val="0D0D0D" w:themeColor="text1" w:themeTint="F2"/>
-          <w:sz w:val="20"/>
-          <w:szCs w:val="20"/>
-        </w:rPr>
-        <w:t>, Flask</w:t>
+          <w:b/>
+          <w:bCs/>
+          <w:color w:val="0D0D0D" w:themeColor="text1" w:themeTint="F2"/>
+          <w:sz w:val="20"/>
+          <w:szCs w:val="20"/>
+        </w:rPr>
+        <w:t>Observability &amp; Evaluation:</w:t>
+      </w:r>
+      <w:r>
+        <w:rPr>
+          <w:rFonts w:ascii="Arial" w:eastAsia="Times New Roman" w:hAnsi="Arial" w:cs="Arial"/>
+          <w:color w:val="0D0D0D" w:themeColor="text1" w:themeTint="F2"/>
+          <w:sz w:val="20"/>
+          <w:szCs w:val="20"/>
+        </w:rPr>
+        <w:t xml:space="preserve"> </w:t>
+      </w:r>
+      <w:proofErr w:type="spellStart"/>
+      <w:r>
+        <w:rPr>
+          <w:rFonts w:ascii="Arial" w:eastAsia="Times New Roman" w:hAnsi="Arial" w:cs="Arial"/>
+          <w:color w:val="0D0D0D" w:themeColor="text1" w:themeTint="F2"/>
+          <w:sz w:val="20"/>
+          <w:szCs w:val="20"/>
+        </w:rPr>
+        <w:t>LangSmith</w:t>
+      </w:r>
+      <w:proofErr w:type="spellEnd"/>
+      <w:r>
+        <w:rPr>
+          <w:rFonts w:ascii="Arial" w:eastAsia="Times New Roman" w:hAnsi="Arial" w:cs="Arial"/>
+          <w:color w:val="0D0D0D" w:themeColor="text1" w:themeTint="F2"/>
+          <w:sz w:val="20"/>
+          <w:szCs w:val="20"/>
+        </w:rPr>
+        <w:t xml:space="preserve">, </w:t>
+      </w:r>
+      <w:proofErr w:type="spellStart"/>
+      <w:r>
+        <w:rPr>
+          <w:rFonts w:ascii="Arial" w:eastAsia="Times New Roman" w:hAnsi="Arial" w:cs="Arial"/>
+          <w:color w:val="0D0D0D" w:themeColor="text1" w:themeTint="F2"/>
+          <w:sz w:val="20"/>
+          <w:szCs w:val="20"/>
+        </w:rPr>
+        <w:t>MLflow</w:t>
+      </w:r>
+      <w:proofErr w:type="spellEnd"/>
+      <w:r>
+        <w:rPr>
+          <w:rFonts w:ascii="Arial" w:eastAsia="Times New Roman" w:hAnsi="Arial" w:cs="Arial"/>
+          <w:color w:val="0D0D0D" w:themeColor="text1" w:themeTint="F2"/>
+          <w:sz w:val="20"/>
+          <w:szCs w:val="20"/>
+        </w:rPr>
+        <w:t>, token and cost metering, confusion matrix metrics</w:t>
       </w:r>
     </w:p>
     <w:p>
@@ -3943,11 +4956,161 @@
       <w:r>
         <w:rPr>
           <w:rFonts w:ascii="Arial" w:eastAsia="Times New Roman" w:hAnsi="Arial" w:cs="Arial"/>
-          <w:color w:val="0D0D0D" w:themeColor="text1" w:themeTint="F2"/>
-          <w:sz w:val="20"/>
-          <w:szCs w:val="20"/>
-        </w:rPr>
-        <w:t>Celery</w:t>
+          <w:b/>
+          <w:bCs/>
+          <w:color w:val="0D0D0D" w:themeColor="text1" w:themeTint="F2"/>
+          <w:sz w:val="20"/>
+          <w:szCs w:val="20"/>
+        </w:rPr>
+        <w:t>Cloud Platforms:</w:t>
+      </w:r>
+      <w:r>
+        <w:rPr>
+          <w:rFonts w:ascii="Arial" w:eastAsia="Times New Roman" w:hAnsi="Arial" w:cs="Arial"/>
+          <w:color w:val="0D0D0D" w:themeColor="text1" w:themeTint="F2"/>
+          <w:sz w:val="20"/>
+          <w:szCs w:val="20"/>
+        </w:rPr>
+        <w:t xml:space="preserve"> GCP (Vertex AI, Cloud Run, Cloud Tasks, Cloud Storage, </w:t>
+      </w:r>
+      <w:proofErr w:type="spellStart"/>
+      <w:r>
+        <w:rPr>
+          <w:rFonts w:ascii="Arial" w:eastAsia="Times New Roman" w:hAnsi="Arial" w:cs="Arial"/>
+          <w:color w:val="0D0D0D" w:themeColor="text1" w:themeTint="F2"/>
+          <w:sz w:val="20"/>
+          <w:szCs w:val="20"/>
+        </w:rPr>
+        <w:t>BigQuery</w:t>
+      </w:r>
+      <w:proofErr w:type="spellEnd"/>
+      <w:r>
+        <w:rPr>
+          <w:rFonts w:ascii="Arial" w:eastAsia="Times New Roman" w:hAnsi="Arial" w:cs="Arial"/>
+          <w:color w:val="0D0D0D" w:themeColor="text1" w:themeTint="F2"/>
+          <w:sz w:val="20"/>
+          <w:szCs w:val="20"/>
+        </w:rPr>
+        <w:t>, Cloud Functions), AWS (Bedrock, EC2)</w:t>
+      </w:r>
+    </w:p>
+    <w:p>
+      <w:pPr>
+        <w:numPr>
+          <w:ilvl w:val="0"/>
+          <w:numId w:val="1"/>
+        </w:numPr>
+        <w:spacing w:line="276" w:lineRule="auto"/>
+        <w:ind w:left="215" w:right="28" w:hanging="215"/>
+        <w:rPr>
+          <w:rFonts w:ascii="Arial" w:eastAsia="Times New Roman" w:hAnsi="Arial" w:cs="Arial"/>
+          <w:color w:val="0D0D0D" w:themeColor="text1" w:themeTint="F2"/>
+          <w:sz w:val="20"/>
+          <w:szCs w:val="20"/>
+        </w:rPr>
+      </w:pPr>
+      <w:r>
+        <w:rPr>
+          <w:rFonts w:ascii="Arial" w:eastAsia="Times New Roman" w:hAnsi="Arial" w:cs="Arial"/>
+          <w:color w:val="0D0D0D" w:themeColor="text1" w:themeTint="F2"/>
+          <w:sz w:val="20"/>
+          <w:szCs w:val="20"/>
+        </w:rPr>
+        <w:t>Docker, Git/GitHub/</w:t>
+      </w:r>
+      <w:proofErr w:type="spellStart"/>
+      <w:r>
+        <w:rPr>
+          <w:rFonts w:ascii="Arial" w:eastAsia="Times New Roman" w:hAnsi="Arial" w:cs="Arial"/>
+          <w:color w:val="0D0D0D" w:themeColor="text1" w:themeTint="F2"/>
+          <w:sz w:val="20"/>
+          <w:szCs w:val="20"/>
+        </w:rPr>
+        <w:t>DagsHub</w:t>
+      </w:r>
+      <w:proofErr w:type="spellEnd"/>
+      <w:r>
+        <w:rPr>
+          <w:rFonts w:ascii="Arial" w:eastAsia="Times New Roman" w:hAnsi="Arial" w:cs="Arial"/>
+          <w:color w:val="0D0D0D" w:themeColor="text1" w:themeTint="F2"/>
+          <w:sz w:val="20"/>
+          <w:szCs w:val="20"/>
+        </w:rPr>
+        <w:t xml:space="preserve">, </w:t>
+      </w:r>
+      <w:proofErr w:type="spellStart"/>
+      <w:r>
+        <w:rPr>
+          <w:rFonts w:ascii="Arial" w:eastAsia="Times New Roman" w:hAnsi="Arial" w:cs="Arial"/>
+          <w:color w:val="0D0D0D" w:themeColor="text1" w:themeTint="F2"/>
+          <w:sz w:val="20"/>
+          <w:szCs w:val="20"/>
+        </w:rPr>
+        <w:t>PySpark</w:t>
+      </w:r>
+      <w:proofErr w:type="spellEnd"/>
+      <w:r>
+        <w:rPr>
+          <w:rFonts w:ascii="Arial" w:eastAsia="Times New Roman" w:hAnsi="Arial" w:cs="Arial"/>
+          <w:color w:val="0D0D0D" w:themeColor="text1" w:themeTint="F2"/>
+          <w:sz w:val="20"/>
+          <w:szCs w:val="20"/>
+        </w:rPr>
+        <w:t>, Data Visualization</w:t>
+      </w:r>
+    </w:p>
+    <w:p>
+      <w:pPr>
+        <w:pStyle w:val="ListParagraph"/>
+        <w:spacing w:after="0" w:line="276" w:lineRule="auto"/>
+        <w:ind w:left="53" w:right="26"/>
+        <w:rPr>
+          <w:rFonts w:ascii="Arial" w:eastAsia="Times New Roman" w:hAnsi="Arial" w:cs="Arial"/>
+          <w:b/>
+          <w:color w:val="0D0D0D" w:themeColor="text1" w:themeTint="F2"/>
+          <w:sz w:val="20"/>
+          <w:szCs w:val="20"/>
+        </w:rPr>
+      </w:pPr>
+      <w:r>
+        <w:rPr>
+          <w:rFonts w:ascii="Arial" w:eastAsia="Times New Roman" w:hAnsi="Arial" w:cs="Arial"/>
+          <w:b/>
+          <w:color w:val="0D0D0D" w:themeColor="text1" w:themeTint="F2"/>
+          <w:sz w:val="20"/>
+          <w:szCs w:val="20"/>
+        </w:rPr>
+        <w:t>ORGANIZATION</w:t>
+      </w:r>
+      <w:r>
+        <w:rPr>
+          <w:rFonts w:ascii="Arial" w:eastAsia="Times New Roman" w:hAnsi="Arial" w:cs="Arial"/>
+          <w:b/>
+          <w:color w:val="0D0D0D" w:themeColor="text1" w:themeTint="F2"/>
+          <w:sz w:val="20"/>
+          <w:szCs w:val="20"/>
+        </w:rPr>
+        <w:t>S</w:t>
+      </w:r>
+      <w:r>
+        <w:rPr>
+          <w:rFonts w:ascii="Arial" w:eastAsia="Times New Roman" w:hAnsi="Arial" w:cs="Arial"/>
+          <w:b/>
+          <w:color w:val="0D0D0D" w:themeColor="text1" w:themeTint="F2"/>
+          <w:sz w:val="20"/>
+          <w:szCs w:val="20"/>
+        </w:rPr>
+        <w:t xml:space="preserve"> AND ACTIVIT</w:t>
+      </w:r>
+      <w:r>
+        <w:rPr>
+          <w:rFonts w:ascii="Arial" w:eastAsia="Times New Roman" w:hAnsi="Arial" w:cs="Arial"/>
+          <w:b/>
+          <w:color w:val="0D0D0D" w:themeColor="text1" w:themeTint="F2"/>
+          <w:sz w:val="20"/>
+          <w:szCs w:val="20"/>
+        </w:rPr>
+        <w:t>IES</w:t>
       </w:r>
     </w:p>
     <w:p>
@@ -3972,7 +5135,99 @@
           <w:sz w:val="20"/>
           <w:szCs w:val="20"/>
         </w:rPr>
-        <w:t>Docker</w:t>
+        <w:t>Data Science Club</w:t>
+      </w:r>
+      <w:r>
+        <w:rPr>
+          <w:rFonts w:ascii="Arial" w:eastAsia="Times New Roman" w:hAnsi="Arial" w:cs="Arial"/>
+          <w:color w:val="0D0D0D" w:themeColor="text1" w:themeTint="F2"/>
+          <w:sz w:val="20"/>
+          <w:szCs w:val="20"/>
+        </w:rPr>
+        <w:t xml:space="preserve"> (DSC)</w:t>
+      </w:r>
+      <w:r>
+        <w:rPr>
+          <w:rFonts w:ascii="Arial" w:eastAsia="Times New Roman" w:hAnsi="Arial" w:cs="Arial"/>
+          <w:color w:val="0D0D0D" w:themeColor="text1" w:themeTint="F2"/>
+          <w:sz w:val="20"/>
+          <w:szCs w:val="20"/>
+        </w:rPr>
+        <w:t xml:space="preserve"> and </w:t>
+      </w:r>
+      <w:proofErr w:type="spellStart"/>
+      <w:r>
+        <w:rPr>
+          <w:rFonts w:ascii="Arial" w:eastAsia="Times New Roman" w:hAnsi="Arial" w:cs="Arial"/>
+          <w:color w:val="0D0D0D" w:themeColor="text1" w:themeTint="F2"/>
+          <w:sz w:val="20"/>
+          <w:szCs w:val="20"/>
+        </w:rPr>
+        <w:t>Ureeka</w:t>
+      </w:r>
+      <w:proofErr w:type="spellEnd"/>
+      <w:r>
+        <w:rPr>
+          <w:rFonts w:ascii="Arial" w:eastAsia="Times New Roman" w:hAnsi="Arial" w:cs="Arial"/>
+          <w:color w:val="0D0D0D" w:themeColor="text1" w:themeTint="F2"/>
+          <w:sz w:val="20"/>
+          <w:szCs w:val="20"/>
+        </w:rPr>
+        <w:t xml:space="preserve"> BINUS University</w:t>
+      </w:r>
+      <w:r>
+        <w:rPr>
+          <w:rFonts w:ascii="Arial" w:eastAsia="Times New Roman" w:hAnsi="Arial" w:cs="Arial"/>
+          <w:color w:val="0D0D0D" w:themeColor="text1" w:themeTint="F2"/>
+          <w:sz w:val="20"/>
+          <w:szCs w:val="20"/>
+        </w:rPr>
+        <w:t xml:space="preserve"> </w:t>
+      </w:r>
+      <w:r>
+        <w:rPr>
+          <w:rFonts w:ascii="Arial" w:eastAsia="Times New Roman" w:hAnsi="Arial" w:cs="Arial"/>
+          <w:color w:val="0D0D0D" w:themeColor="text1" w:themeTint="F2"/>
+          <w:sz w:val="20"/>
+          <w:szCs w:val="20"/>
+        </w:rPr>
+        <w:t>(2024</w:t>
+      </w:r>
+      <w:r>
+        <w:rPr>
+          <w:rFonts w:ascii="Arial" w:eastAsia="Times New Roman" w:hAnsi="Arial" w:cs="Arial"/>
+          <w:color w:val="0D0D0D" w:themeColor="text1" w:themeTint="F2"/>
+          <w:sz w:val="20"/>
+          <w:szCs w:val="20"/>
+        </w:rPr>
+        <w:t xml:space="preserve"> </w:t>
+      </w:r>
+      <w:r>
+        <w:rPr>
+          <w:rFonts w:ascii="Arial" w:hAnsi="Arial" w:cs="Arial"/>
+          <w:bCs/>
+          <w:color w:val="0D0D0D" w:themeColor="text1" w:themeTint="F2"/>
+          <w:sz w:val="20"/>
+        </w:rPr>
+        <w:t xml:space="preserve">– </w:t>
+      </w:r>
+      <w:r>
+        <w:rPr>
+          <w:rFonts w:ascii="Arial" w:eastAsia="Times New Roman" w:hAnsi="Arial" w:cs="Arial"/>
+          <w:color w:val="0D0D0D" w:themeColor="text1" w:themeTint="F2"/>
+          <w:sz w:val="20"/>
+          <w:szCs w:val="20"/>
+        </w:rPr>
+        <w:t>Present</w:t>
+      </w:r>
+      <w:r>
+        <w:rPr>
+          <w:rFonts w:ascii="Arial" w:eastAsia="Times New Roman" w:hAnsi="Arial" w:cs="Arial"/>
+          <w:color w:val="0D0D0D" w:themeColor="text1" w:themeTint="F2"/>
+          <w:sz w:val="20"/>
+          <w:szCs w:val="20"/>
+        </w:rPr>
+        <w:t>)</w:t>
       </w:r>
     </w:p>
     <w:p>
@@ -3997,294 +5252,6 @@
           <w:sz w:val="20"/>
           <w:szCs w:val="20"/>
         </w:rPr>
-        <w:t>Cloud &amp;</w:t>
-      </w:r>
-      <w:r>
-        <w:rPr>
-          <w:rFonts w:ascii="Arial" w:eastAsia="Times New Roman" w:hAnsi="Arial" w:cs="Arial"/>
-          <w:b/>
-          <w:bCs/>
-          <w:color w:val="0D0D0D" w:themeColor="text1" w:themeTint="F2"/>
-          <w:sz w:val="20"/>
-          <w:szCs w:val="20"/>
-        </w:rPr>
-        <w:t xml:space="preserve"> </w:t>
-      </w:r>
-      <w:r>
-        <w:rPr>
-          <w:rFonts w:ascii="Arial" w:eastAsia="Times New Roman" w:hAnsi="Arial" w:cs="Arial"/>
-          <w:color w:val="0D0D0D" w:themeColor="text1" w:themeTint="F2"/>
-          <w:sz w:val="20"/>
-          <w:szCs w:val="20"/>
-        </w:rPr>
-        <w:t>Backend</w:t>
-      </w:r>
-      <w:r>
-        <w:rPr>
-          <w:rFonts w:ascii="Arial" w:eastAsia="Times New Roman" w:hAnsi="Arial" w:cs="Arial"/>
-          <w:b/>
-          <w:bCs/>
-          <w:color w:val="0D0D0D" w:themeColor="text1" w:themeTint="F2"/>
-          <w:sz w:val="20"/>
-          <w:szCs w:val="20"/>
-        </w:rPr>
-        <w:t xml:space="preserve"> </w:t>
-      </w:r>
-      <w:r>
-        <w:rPr>
-          <w:rFonts w:ascii="Arial" w:eastAsia="Times New Roman" w:hAnsi="Arial" w:cs="Arial"/>
-          <w:color w:val="0D0D0D" w:themeColor="text1" w:themeTint="F2"/>
-          <w:sz w:val="20"/>
-          <w:szCs w:val="20"/>
-        </w:rPr>
-        <w:t>Platforms</w:t>
-      </w:r>
-      <w:r>
-        <w:rPr>
-          <w:rFonts w:ascii="Arial" w:eastAsia="Times New Roman" w:hAnsi="Arial" w:cs="Arial"/>
-          <w:b/>
-          <w:bCs/>
-          <w:color w:val="0D0D0D" w:themeColor="text1" w:themeTint="F2"/>
-          <w:sz w:val="20"/>
-          <w:szCs w:val="20"/>
-        </w:rPr>
-        <w:t>:</w:t>
-      </w:r>
-      <w:r>
-        <w:rPr>
-          <w:rFonts w:ascii="Arial" w:eastAsia="Times New Roman" w:hAnsi="Arial" w:cs="Arial"/>
-          <w:color w:val="0D0D0D" w:themeColor="text1" w:themeTint="F2"/>
-          <w:sz w:val="20"/>
-          <w:szCs w:val="20"/>
-        </w:rPr>
-        <w:t xml:space="preserve"> GCP (BigQuery, Cloud Storage, Cloud Functions), AWS (EC2), </w:t>
-      </w:r>
-      <w:r>
-        <w:rPr>
-          <w:rFonts w:ascii="Arial" w:eastAsia="Times New Roman" w:hAnsi="Arial" w:cs="Arial"/>
-          <w:color w:val="0D0D0D" w:themeColor="text1" w:themeTint="F2"/>
-          <w:sz w:val="20"/>
-          <w:szCs w:val="20"/>
-        </w:rPr>
-        <w:t>S</w:t>
-      </w:r>
-      <w:r>
-        <w:rPr>
-          <w:rFonts w:ascii="Arial" w:eastAsia="Times New Roman" w:hAnsi="Arial" w:cs="Arial"/>
-          <w:color w:val="0D0D0D" w:themeColor="text1" w:themeTint="F2"/>
-          <w:sz w:val="20"/>
-          <w:szCs w:val="20"/>
-        </w:rPr>
-        <w:t>upabas</w:t>
-      </w:r>
-      <w:r>
-        <w:rPr>
-          <w:rFonts w:ascii="Arial" w:eastAsia="Times New Roman" w:hAnsi="Arial" w:cs="Arial"/>
-          <w:color w:val="0D0D0D" w:themeColor="text1" w:themeTint="F2"/>
-          <w:sz w:val="20"/>
-          <w:szCs w:val="20"/>
-        </w:rPr>
-        <w:t>e</w:t>
-      </w:r>
-    </w:p>
-    <w:p>
-      <w:pPr>
-        <w:numPr>
-          <w:ilvl w:val="0"/>
-          <w:numId w:val="1"/>
-        </w:numPr>
-        <w:spacing w:line="276" w:lineRule="auto"/>
-        <w:ind w:left="215" w:right="28" w:hanging="215"/>
-        <w:rPr>
-          <w:rFonts w:ascii="Arial" w:eastAsia="Times New Roman" w:hAnsi="Arial" w:cs="Arial"/>
-          <w:color w:val="0D0D0D" w:themeColor="text1" w:themeTint="F2"/>
-          <w:sz w:val="20"/>
-          <w:szCs w:val="20"/>
-        </w:rPr>
-      </w:pPr>
-      <w:r>
-        <w:rPr>
-          <w:rFonts w:ascii="Arial" w:eastAsia="Times New Roman" w:hAnsi="Arial" w:cs="Arial"/>
-          <w:color w:val="0D0D0D" w:themeColor="text1" w:themeTint="F2"/>
-          <w:sz w:val="20"/>
-          <w:szCs w:val="20"/>
-        </w:rPr>
-        <w:t>PySpark</w:t>
-      </w:r>
-    </w:p>
-    <w:p>
-      <w:pPr>
-        <w:pStyle w:val="ListParagraph"/>
-        <w:spacing w:after="0" w:line="276" w:lineRule="auto"/>
-        <w:ind w:left="53" w:right="26"/>
-        <w:rPr>
-          <w:rFonts w:ascii="Arial" w:eastAsia="Times New Roman" w:hAnsi="Arial" w:cs="Arial"/>
-          <w:b/>
-          <w:color w:val="0D0D0D" w:themeColor="text1" w:themeTint="F2"/>
-          <w:sz w:val="20"/>
-          <w:szCs w:val="20"/>
-        </w:rPr>
-      </w:pPr>
-      <w:r>
-        <w:rPr>
-          <w:rFonts w:ascii="Arial" w:eastAsia="Times New Roman" w:hAnsi="Arial" w:cs="Arial"/>
-          <w:b/>
-          <w:color w:val="0D0D0D" w:themeColor="text1" w:themeTint="F2"/>
-          <w:sz w:val="20"/>
-          <w:szCs w:val="20"/>
-        </w:rPr>
-        <w:t>ORGANIZATION</w:t>
-      </w:r>
-      <w:r>
-        <w:rPr>
-          <w:rFonts w:ascii="Arial" w:eastAsia="Times New Roman" w:hAnsi="Arial" w:cs="Arial"/>
-          <w:b/>
-          <w:color w:val="0D0D0D" w:themeColor="text1" w:themeTint="F2"/>
-          <w:sz w:val="20"/>
-          <w:szCs w:val="20"/>
-        </w:rPr>
-        <w:t>S</w:t>
-      </w:r>
-      <w:r>
-        <w:rPr>
-          <w:rFonts w:ascii="Arial" w:eastAsia="Times New Roman" w:hAnsi="Arial" w:cs="Arial"/>
-          <w:b/>
-          <w:color w:val="0D0D0D" w:themeColor="text1" w:themeTint="F2"/>
-          <w:sz w:val="20"/>
-          <w:szCs w:val="20"/>
-        </w:rPr>
-        <w:t xml:space="preserve"> AND ACTIVIT</w:t>
-      </w:r>
-      <w:r>
-        <w:rPr>
-          <w:rFonts w:ascii="Arial" w:eastAsia="Times New Roman" w:hAnsi="Arial" w:cs="Arial"/>
-          <w:b/>
-          <w:color w:val="0D0D0D" w:themeColor="text1" w:themeTint="F2"/>
-          <w:sz w:val="20"/>
-          <w:szCs w:val="20"/>
-        </w:rPr>
-        <w:t>IES</w:t>
-      </w:r>
-    </w:p>
-    <w:p>
-      <w:pPr>
-        <w:numPr>
-          <w:ilvl w:val="0"/>
-          <w:numId w:val="1"/>
-        </w:numPr>
-        <w:spacing w:after="30" w:line="276" w:lineRule="auto"/>
-        <w:ind w:left="215" w:right="28" w:hanging="215"/>
-        <w:rPr>
-          <w:rFonts w:ascii="Arial" w:eastAsia="Times New Roman" w:hAnsi="Arial" w:cs="Arial"/>
-          <w:color w:val="0D0D0D" w:themeColor="text1" w:themeTint="F2"/>
-          <w:sz w:val="20"/>
-          <w:szCs w:val="20"/>
-        </w:rPr>
-      </w:pPr>
-      <w:r>
-        <w:rPr>
-          <w:rFonts w:ascii="Arial" w:eastAsia="Times New Roman" w:hAnsi="Arial" w:cs="Arial"/>
-          <w:color w:val="0D0D0D" w:themeColor="text1" w:themeTint="F2"/>
-          <w:sz w:val="20"/>
-          <w:szCs w:val="20"/>
-        </w:rPr>
-        <w:t>Data Science Club</w:t>
-      </w:r>
-      <w:r>
-        <w:rPr>
-          <w:rFonts w:ascii="Arial" w:eastAsia="Times New Roman" w:hAnsi="Arial" w:cs="Arial"/>
-          <w:color w:val="0D0D0D" w:themeColor="text1" w:themeTint="F2"/>
-          <w:sz w:val="20"/>
-          <w:szCs w:val="20"/>
-        </w:rPr>
-        <w:t xml:space="preserve"> (DSC)</w:t>
-      </w:r>
-      <w:r>
-        <w:rPr>
-          <w:rFonts w:ascii="Arial" w:eastAsia="Times New Roman" w:hAnsi="Arial" w:cs="Arial"/>
-          <w:color w:val="0D0D0D" w:themeColor="text1" w:themeTint="F2"/>
-          <w:sz w:val="20"/>
-          <w:szCs w:val="20"/>
-        </w:rPr>
-        <w:t xml:space="preserve"> and Ureeka BINUS University</w:t>
-      </w:r>
-      <w:r>
-        <w:rPr>
-          <w:rFonts w:ascii="Arial" w:eastAsia="Times New Roman" w:hAnsi="Arial" w:cs="Arial"/>
-          <w:color w:val="0D0D0D" w:themeColor="text1" w:themeTint="F2"/>
-          <w:sz w:val="20"/>
-          <w:szCs w:val="20"/>
-        </w:rPr>
-        <w:t xml:space="preserve"> </w:t>
-      </w:r>
-      <w:r>
-        <w:rPr>
-          <w:rFonts w:ascii="Arial" w:eastAsia="Times New Roman" w:hAnsi="Arial" w:cs="Arial"/>
-          <w:color w:val="0D0D0D" w:themeColor="text1" w:themeTint="F2"/>
-          <w:sz w:val="20"/>
-          <w:szCs w:val="20"/>
-        </w:rPr>
-        <w:t>(2024</w:t>
-      </w:r>
-      <w:r>
-        <w:rPr>
-          <w:rFonts w:ascii="Arial" w:eastAsia="Times New Roman" w:hAnsi="Arial" w:cs="Arial"/>
-          <w:color w:val="0D0D0D" w:themeColor="text1" w:themeTint="F2"/>
-          <w:sz w:val="20"/>
-          <w:szCs w:val="20"/>
-        </w:rPr>
-        <w:t xml:space="preserve"> </w:t>
-      </w:r>
-      <w:r>
-        <w:rPr>
-          <w:rFonts w:ascii="Arial" w:hAnsi="Arial" w:cs="Arial"/>
-          <w:bCs/>
-          <w:color w:val="0D0D0D" w:themeColor="text1" w:themeTint="F2"/>
-          <w:sz w:val="20"/>
-        </w:rPr>
-        <w:t xml:space="preserve">– </w:t>
-      </w:r>
-      <w:r>
-        <w:rPr>
-          <w:rFonts w:ascii="Arial" w:eastAsia="Times New Roman" w:hAnsi="Arial" w:cs="Arial"/>
-          <w:color w:val="0D0D0D" w:themeColor="text1" w:themeTint="F2"/>
-          <w:sz w:val="20"/>
-          <w:szCs w:val="20"/>
-        </w:rPr>
-        <w:t>Present</w:t>
-      </w:r>
-      <w:r>
-        <w:rPr>
-          <w:rFonts w:ascii="Arial" w:eastAsia="Times New Roman" w:hAnsi="Arial" w:cs="Arial"/>
-          <w:color w:val="0D0D0D" w:themeColor="text1" w:themeTint="F2"/>
-          <w:sz w:val="20"/>
-          <w:szCs w:val="20"/>
-        </w:rPr>
-        <w:t>)</w:t>
-      </w:r>
-    </w:p>
-    <w:p>
-      <w:pPr>
-        <w:numPr>
-          <w:ilvl w:val="0"/>
-          <w:numId w:val="1"/>
-        </w:numPr>
-        <w:spacing w:after="30" w:line="276" w:lineRule="auto"/>
-        <w:ind w:left="215" w:right="28" w:hanging="215"/>
-        <w:rPr>
-          <w:rFonts w:ascii="Arial" w:eastAsia="Times New Roman" w:hAnsi="Arial" w:cs="Arial"/>
-          <w:color w:val="0D0D0D" w:themeColor="text1" w:themeTint="F2"/>
-          <w:sz w:val="20"/>
-          <w:szCs w:val="20"/>
-        </w:rPr>
-      </w:pPr>
-      <w:r>
-        <w:rPr>
-          <w:rFonts w:ascii="Arial" w:eastAsia="Times New Roman" w:hAnsi="Arial" w:cs="Arial"/>
-          <w:color w:val="0D0D0D" w:themeColor="text1" w:themeTint="F2"/>
-          <w:sz w:val="20"/>
-          <w:szCs w:val="20"/>
-        </w:rPr>
         <w:t>Badminton (2023</w:t>
       </w:r>
       <w:r>
@@ -4303,7 +5270,27 @@
           <w:sz w:val="20"/>
           <w:szCs w:val="20"/>
         </w:rPr>
-        <w:t>) and Binusian Gaming (2022</w:t>
+        <w:t xml:space="preserve">) and </w:t>
+      </w:r>
+      <w:proofErr w:type="spellStart"/>
+      <w:r>
+        <w:rPr>
+          <w:rFonts w:ascii="Arial" w:eastAsia="Times New Roman" w:hAnsi="Arial" w:cs="Arial"/>
+          <w:color w:val="0D0D0D" w:themeColor="text1" w:themeTint="F2"/>
+          <w:sz w:val="20"/>
+          <w:szCs w:val="20"/>
+        </w:rPr>
+        <w:t>Binusian</w:t>
+      </w:r>
+      <w:proofErr w:type="spellEnd"/>
+      <w:r>
+        <w:rPr>
+          <w:rFonts w:ascii="Arial" w:eastAsia="Times New Roman" w:hAnsi="Arial" w:cs="Arial"/>
+          <w:color w:val="0D0D0D" w:themeColor="text1" w:themeTint="F2"/>
+          <w:sz w:val="20"/>
+          <w:szCs w:val="20"/>
+        </w:rPr>
+        <w:t xml:space="preserve"> Gaming (2022</w:t>
       </w:r>
       <w:r>
         <w:rPr>
@@ -6379,7 +7366,7 @@
   <w:style w:type="paragraph" w:default="1" w:styleId="Normal">
     <w:name w:val="Normal"/>
     <w:qFormat/>
-    <w:rsid w:val="00810E38"/>
+    <w:rsid w:val="00D54209"/>
     <w:rPr>
       <w:rFonts w:ascii="Calibri" w:eastAsia="Calibri" w:hAnsi="Calibri" w:cs="Calibri"/>
       <w:color w:val="000000"/>

</xml_diff>

<commit_message>
Update resume: anonymized Vision QC project and expanded skills
Matches the portfolio: the project is now "Vision QC (Fiber Installation
Audit)" with no client name, and the POC label is gone. Skills gain the
LiveKit and Pipecat serving stack.
</commit_message>
<xml_diff>
--- a/downloads/Michael Geraldin Wijaya Resume.docx
+++ b/downloads/Michael Geraldin Wijaya Resume.docx
@@ -2530,23 +2530,13 @@
           <w:bCs/>
         </w:rPr>
       </w:pPr>
-      <w:proofErr w:type="spellStart"/>
       <w:r>
         <w:rPr>
           <w:rFonts w:ascii="Arial" w:hAnsi="Arial" w:cs="Arial"/>
           <w:b/>
           <w:bCs/>
         </w:rPr>
-        <w:t>LinkNet</w:t>
-      </w:r>
-      <w:proofErr w:type="spellEnd"/>
-      <w:r>
-        <w:rPr>
-          <w:rFonts w:ascii="Arial" w:hAnsi="Arial" w:cs="Arial"/>
-          <w:b/>
-          <w:bCs/>
-        </w:rPr>
-        <w:t xml:space="preserve"> Vision QC POC</w:t>
+        <w:t>Vision QC (Fiber Installation Audit)</w:t>
       </w:r>
     </w:p>
     <w:p>

</xml_diff>